<commit_message>
capitulos de 2 al 8 completos con imagenes
</commit_message>
<xml_diff>
--- a/backend/Capitulos_Word/Capitulo 3.docx
+++ b/backend/Capitulos_Word/Capitulo 3.docx
@@ -1117,7 +1117,15 @@
         <w:pStyle w:val="Cuerpo"/>
       </w:pPr>
       <w:r>
-        <w:t xml:space="preserve">Ocho de las treinta y siete reglas del backend viven ahí, identificadas como </w:t>
+        <w:t xml:space="preserve">Ocho de las treinta y siete reglas del </w:t>
+      </w:r>
+      <w:proofErr w:type="spellStart"/>
+      <w:r>
+        <w:t>backend</w:t>
+      </w:r>
+      <w:proofErr w:type="spellEnd"/>
+      <w:r>
+        <w:t xml:space="preserve"> viven ahí, identificadas como </w:t>
       </w:r>
       <w:r>
         <w:rPr>
@@ -1183,14 +1191,24 @@
         <w:lastRenderedPageBreak/>
         <w:t>puede. Su nombre no dice nada —</w:t>
       </w:r>
+      <w:proofErr w:type="spellStart"/>
       <w:r>
         <w:rPr>
           <w:rStyle w:val="Cdigoenlnea"/>
         </w:rPr>
         <w:t>MissingGreenlet</w:t>
       </w:r>
-      <w:r>
-        <w:t>— y su causa está siempre lejos de donde salta. Entenderla exige entender cómo SQLAlchemy implementa su capa asincrónica, y esta clase lo desarma.</w:t>
+      <w:proofErr w:type="spellEnd"/>
+      <w:r>
+        <w:t xml:space="preserve">— y su causa está siempre lejos de donde salta. Entenderla exige entender cómo </w:t>
+      </w:r>
+      <w:proofErr w:type="spellStart"/>
+      <w:r>
+        <w:t>SQLAlchemy</w:t>
+      </w:r>
+      <w:proofErr w:type="spellEnd"/>
+      <w:r>
+        <w:t xml:space="preserve"> implementa su capa asincrónica, y esta clase lo desarma.</w:t>
       </w:r>
     </w:p>
     <w:p>
@@ -1224,7 +1242,15 @@
         <w:t>explicar qué hace cada una de las ocho reglas EA y qué problema previene</w:t>
       </w:r>
       <w:r>
-        <w:t>, reconocer una llamada bloqueante en código ajeno, y diagnosticar una excepción de greenlet a partir de su traza.</w:t>
+        <w:t xml:space="preserve">, reconocer una llamada bloqueante en código ajeno, y diagnosticar una excepción de </w:t>
+      </w:r>
+      <w:proofErr w:type="spellStart"/>
+      <w:r>
+        <w:t>greenlet</w:t>
+      </w:r>
+      <w:proofErr w:type="spellEnd"/>
+      <w:r>
+        <w:t xml:space="preserve"> a partir de su traza.</w:t>
       </w:r>
     </w:p>
     <w:p>
@@ -1301,12 +1327,21 @@
           <w:color w:val="000000"/>
         </w:rPr>
       </w:pPr>
+      <w:proofErr w:type="spellStart"/>
       <w:r>
         <w:rPr>
           <w:rFonts w:ascii="Calibri" w:hAnsi="Calibri" w:cs="Calibri"/>
           <w:color w:val="000000"/>
         </w:rPr>
-        <w:t>Corrutinas, tareas y puntos de cesión.</w:t>
+        <w:t>Corrutinas</w:t>
+      </w:r>
+      <w:proofErr w:type="spellEnd"/>
+      <w:r>
+        <w:rPr>
+          <w:rFonts w:ascii="Calibri" w:hAnsi="Calibri" w:cs="Calibri"/>
+          <w:color w:val="000000"/>
+        </w:rPr>
+        <w:t>, tareas y puntos de cesión.</w:t>
       </w:r>
     </w:p>
     <w:p>
@@ -1374,7 +1409,23 @@
           <w:rFonts w:ascii="Calibri" w:hAnsi="Calibri" w:cs="Calibri"/>
           <w:color w:val="000000"/>
         </w:rPr>
-        <w:t>La regla del greenlet, explicada.</w:t>
+        <w:t xml:space="preserve">La regla del </w:t>
+      </w:r>
+      <w:proofErr w:type="spellStart"/>
+      <w:r>
+        <w:rPr>
+          <w:rFonts w:ascii="Calibri" w:hAnsi="Calibri" w:cs="Calibri"/>
+          <w:color w:val="000000"/>
+        </w:rPr>
+        <w:t>greenlet</w:t>
+      </w:r>
+      <w:proofErr w:type="spellEnd"/>
+      <w:r>
+        <w:rPr>
+          <w:rFonts w:ascii="Calibri" w:hAnsi="Calibri" w:cs="Calibri"/>
+          <w:color w:val="000000"/>
+        </w:rPr>
+        <w:t>, explicada.</w:t>
       </w:r>
     </w:p>
     <w:p>
@@ -1509,7 +1560,15 @@
         <w:t>Primera etapa: las funciones de retorno.</w:t>
       </w:r>
       <w:r>
-        <w:t xml:space="preserve"> Los primeros marcos de trabajo asincrónicos de Python —Twisted en 2002, Tornado a partir de 2009— resolvieron la concurrencia con el mismo mecanismo que el navegador usó durante años: registrar una función que se ejecuta cuando algo termina. Funcionaba, y tenía el problema que la otra mitad de la cursada estudia con el mismo nombre: </w:t>
+        <w:t xml:space="preserve"> Los primeros marcos de trabajo asincrónicos de Python —</w:t>
+      </w:r>
+      <w:proofErr w:type="spellStart"/>
+      <w:r>
+        <w:t>Twisted</w:t>
+      </w:r>
+      <w:proofErr w:type="spellEnd"/>
+      <w:r>
+        <w:t xml:space="preserve"> en 2002, Tornado a partir de 2009— resolvieron la concurrencia con el mismo mecanismo que el navegador usó durante años: registrar una función que se ejecuta cuando algo termina. Funcionaba, y tenía el problema que la otra mitad de la cursada estudia con el mismo nombre: </w:t>
       </w:r>
       <w:r>
         <w:rPr>
@@ -1526,7 +1585,21 @@
         <w:rPr>
           <w:b/>
         </w:rPr>
-        <w:t>Segunda etapa: los generadores como corrutinas.</w:t>
+        <w:t xml:space="preserve">Segunda etapa: los generadores como </w:t>
+      </w:r>
+      <w:proofErr w:type="spellStart"/>
+      <w:r>
+        <w:rPr>
+          <w:b/>
+        </w:rPr>
+        <w:t>corrutinas</w:t>
+      </w:r>
+      <w:proofErr w:type="spellEnd"/>
+      <w:r>
+        <w:rPr>
+          <w:b/>
+        </w:rPr>
+        <w:t>.</w:t>
       </w:r>
       <w:r>
         <w:t xml:space="preserve"> Python tenía desde 2001 una herramienta que resultó ser exactamente lo que hacía falta. Un generador </w:t>
@@ -1538,14 +1611,38 @@
         <w:t>puede suspenderse y reanudarse</w:t>
       </w:r>
       <w:r>
-        <w:t xml:space="preserve">, que es justamente el comportamiento de una corrutina. El PEP 342, en 2005, lo hizo bidireccional —el generador podía recibir valores al reanudarse— y el PEP 380, en 2009, agregó </w:t>
-      </w:r>
+        <w:t xml:space="preserve">, que es justamente el comportamiento de una </w:t>
+      </w:r>
+      <w:proofErr w:type="spellStart"/>
+      <w:r>
+        <w:t>corrutina</w:t>
+      </w:r>
+      <w:proofErr w:type="spellEnd"/>
+      <w:r>
+        <w:t xml:space="preserve">. El PEP 342, en 2005, lo hizo bidireccional —el generador podía recibir valores al reanudarse— y el PEP 380, en 2009, agregó </w:t>
+      </w:r>
+      <w:proofErr w:type="spellStart"/>
       <w:r>
         <w:rPr>
           <w:rStyle w:val="Cdigoenlnea"/>
         </w:rPr>
-        <w:t>yield from</w:t>
-      </w:r>
+        <w:t>yield</w:t>
+      </w:r>
+      <w:proofErr w:type="spellEnd"/>
+      <w:r>
+        <w:rPr>
+          <w:rStyle w:val="Cdigoenlnea"/>
+        </w:rPr>
+        <w:t xml:space="preserve"> </w:t>
+      </w:r>
+      <w:proofErr w:type="spellStart"/>
+      <w:r>
+        <w:rPr>
+          <w:rStyle w:val="Cdigoenlnea"/>
+        </w:rPr>
+        <w:t>from</w:t>
+      </w:r>
+      <w:proofErr w:type="spellEnd"/>
       <w:r>
         <w:t xml:space="preserve"> para delegar a otro generador.</w:t>
       </w:r>
@@ -1564,7 +1661,15 @@
         <w:t>se leía como secuencial</w:t>
       </w:r>
       <w:r>
-        <w:t>, y durante años se hizo así. El costo era que la sintaxis mentía: lo que parecía un generador era una corrutina, y no había forma de distinguirlos.</w:t>
+        <w:t xml:space="preserve">, y durante años se hizo así. El costo era que la sintaxis mentía: lo que parecía un generador era una </w:t>
+      </w:r>
+      <w:proofErr w:type="spellStart"/>
+      <w:r>
+        <w:t>corrutina</w:t>
+      </w:r>
+      <w:proofErr w:type="spellEnd"/>
+      <w:r>
+        <w:t>, y no había forma de distinguirlos.</w:t>
       </w:r>
     </w:p>
     <w:p>
@@ -1580,12 +1685,14 @@
       <w:r>
         <w:t xml:space="preserve"> El PEP 3156, de 2012, incorporó </w:t>
       </w:r>
+      <w:proofErr w:type="spellStart"/>
       <w:r>
         <w:rPr>
           <w:rStyle w:val="Cdigoenlnea"/>
         </w:rPr>
         <w:t>asyncio</w:t>
       </w:r>
+      <w:proofErr w:type="spellEnd"/>
       <w:r>
         <w:t xml:space="preserve"> al lenguaje, y llegó con Python 3.4 en 2014. Por primera vez hubo </w:t>
       </w:r>
@@ -1616,21 +1723,25 @@
       <w:r>
         <w:t xml:space="preserve"> El PEP 492, de 2015, agregó </w:t>
       </w:r>
+      <w:proofErr w:type="spellStart"/>
       <w:r>
         <w:rPr>
           <w:rStyle w:val="Cdigoenlnea"/>
         </w:rPr>
         <w:t>async</w:t>
       </w:r>
+      <w:proofErr w:type="spellEnd"/>
       <w:r>
         <w:t xml:space="preserve"> y </w:t>
       </w:r>
+      <w:proofErr w:type="spellStart"/>
       <w:r>
         <w:rPr>
           <w:rStyle w:val="Cdigoenlnea"/>
         </w:rPr>
         <w:t>await</w:t>
       </w:r>
+      <w:proofErr w:type="spellEnd"/>
       <w:r>
         <w:t xml:space="preserve"> como palabras del lenguaje, disponibles desde Python 3.5. Eso resolvió la mentira de la etapa anterior: </w:t>
       </w:r>
@@ -1638,7 +1749,21 @@
         <w:rPr>
           <w:b/>
         </w:rPr>
-        <w:t>una corrutina se declara como tal y los puntos donde cede el control se ven a simple vista.</w:t>
+        <w:t xml:space="preserve">una </w:t>
+      </w:r>
+      <w:proofErr w:type="spellStart"/>
+      <w:r>
+        <w:rPr>
+          <w:b/>
+        </w:rPr>
+        <w:t>corrutina</w:t>
+      </w:r>
+      <w:proofErr w:type="spellEnd"/>
+      <w:r>
+        <w:rPr>
+          <w:b/>
+        </w:rPr>
+        <w:t xml:space="preserve"> se declara como tal y los puntos donde cede el control se ven a simple vista.</w:t>
       </w:r>
     </w:p>
     <w:p>
@@ -1663,11 +1788,19 @@
       <w:r>
         <w:t xml:space="preserve"> y la sintaxis </w:t>
       </w:r>
+      <w:proofErr w:type="spellStart"/>
       <w:r>
         <w:rPr>
           <w:rStyle w:val="Cdigoenlnea"/>
         </w:rPr>
-        <w:t>except*</w:t>
+        <w:t>except</w:t>
+      </w:r>
+      <w:proofErr w:type="spellEnd"/>
+      <w:r>
+        <w:rPr>
+          <w:rStyle w:val="Cdigoenlnea"/>
+        </w:rPr>
+        <w:t>*</w:t>
       </w:r>
       <w:r>
         <w:t xml:space="preserve"> con los grupos de excepciones del PEP 654. Eso resolvió un problema real que la sección 3.10 desarrolla: qué pasa cuando varias tareas concurrentes fallan a la vez. </w:t>
@@ -1701,7 +1834,15 @@
         <w:t>Primera: la concurrencia es cooperativa, no preventiva.</w:t>
       </w:r>
       <w:r>
-        <w:t xml:space="preserve"> Nadie interrumpe a una corrutina: </w:t>
+        <w:t xml:space="preserve"> Nadie interrumpe a una </w:t>
+      </w:r>
+      <w:proofErr w:type="spellStart"/>
+      <w:r>
+        <w:t>corrutina</w:t>
+      </w:r>
+      <w:proofErr w:type="spellEnd"/>
+      <w:r>
+        <w:t xml:space="preserve">: </w:t>
       </w:r>
       <w:r>
         <w:rPr>
@@ -1726,12 +1867,14 @@
       <w:r>
         <w:t xml:space="preserve"> Cada </w:t>
       </w:r>
+      <w:proofErr w:type="spellStart"/>
       <w:r>
         <w:rPr>
           <w:rStyle w:val="Cdigoenlnea"/>
         </w:rPr>
         <w:t>await</w:t>
       </w:r>
+      <w:proofErr w:type="spellEnd"/>
       <w:r>
         <w:t xml:space="preserve"> es un lugar donde el control puede irse a otra parte. Eso permite razonar sobre qué puede ocurrir entre dos líneas, algo que con hilos es imposible.</w:t>
       </w:r>
@@ -1744,7 +1887,21 @@
         <w:rPr>
           <w:b/>
         </w:rPr>
-        <w:t>Tercera: una corrutina no hace nada hasta que se la agenda.</w:t>
+        <w:t xml:space="preserve">Tercera: una </w:t>
+      </w:r>
+      <w:proofErr w:type="spellStart"/>
+      <w:r>
+        <w:rPr>
+          <w:b/>
+        </w:rPr>
+        <w:t>corrutina</w:t>
+      </w:r>
+      <w:proofErr w:type="spellEnd"/>
+      <w:r>
+        <w:rPr>
+          <w:b/>
+        </w:rPr>
+        <w:t xml:space="preserve"> no hace nada hasta que se la agenda.</w:t>
       </w:r>
       <w:r>
         <w:t xml:space="preserve"> Llamar a una función asincrónica </w:t>
@@ -1832,7 +1989,15 @@
               <w:pStyle w:val="Cuerpo"/>
             </w:pPr>
             <w:r>
-              <w:t>Nadie te interrumpe. Vos cedés.</w:t>
+              <w:t xml:space="preserve">Nadie te interrumpe. Vos </w:t>
+            </w:r>
+            <w:proofErr w:type="spellStart"/>
+            <w:r>
+              <w:t>cedés</w:t>
+            </w:r>
+            <w:proofErr w:type="spellEnd"/>
+            <w:r>
+              <w:t>.</w:t>
             </w:r>
           </w:p>
           <w:p>
@@ -1840,7 +2005,15 @@
               <w:pStyle w:val="Cuerpo"/>
             </w:pPr>
             <w:r>
-              <w:t>Con hilos, el sistema operativo te saca del procesador cuando se le da la gana. Podés escribir un bucle infinito y el resto del programa sigue andando, porque alguien más te va a interrumpir.</w:t>
+              <w:t xml:space="preserve">Con hilos, el sistema operativo te saca del procesador cuando se le da la gana. </w:t>
+            </w:r>
+            <w:proofErr w:type="spellStart"/>
+            <w:r>
+              <w:t>Podés</w:t>
+            </w:r>
+            <w:proofErr w:type="spellEnd"/>
+            <w:r>
+              <w:t xml:space="preserve"> escribir un bucle infinito y el resto del programa sigue andando, porque alguien más te va a interrumpir.</w:t>
             </w:r>
           </w:p>
           <w:p>
@@ -1848,14 +2021,24 @@
               <w:pStyle w:val="Cuerpo"/>
             </w:pPr>
             <w:r>
-              <w:t xml:space="preserve">Con corrutinas no hay nadie que te interrumpa. Si tu código no llega a un </w:t>
+              <w:t xml:space="preserve">Con </w:t>
             </w:r>
+            <w:proofErr w:type="spellStart"/>
+            <w:r>
+              <w:t>corrutinas</w:t>
+            </w:r>
+            <w:proofErr w:type="spellEnd"/>
+            <w:r>
+              <w:t xml:space="preserve"> no hay nadie que te interrumpa. Si tu código no llega a un </w:t>
+            </w:r>
+            <w:proofErr w:type="spellStart"/>
             <w:r>
               <w:rPr>
                 <w:rStyle w:val="Cdigoenlnea"/>
               </w:rPr>
               <w:t>await</w:t>
             </w:r>
+            <w:proofErr w:type="spellEnd"/>
             <w:r>
               <w:t>, el bucle de eventos no puede hacer absolutamente nada hasta que termines. No es que sea lento: no existe el mecanismo.</w:t>
             </w:r>
@@ -2247,7 +2430,21 @@
               <w:rPr>
                 <w:rFonts w:cs="Calibri"/>
               </w:rPr>
-              <w:t>El bloqueo global del intérprete se nombra en toda discusión sobre Python y casi siempre mal. Quedate con esto:</w:t>
+              <w:t xml:space="preserve">El bloqueo global del intérprete se nombra en toda discusión sobre Python y casi siempre mal. </w:t>
+            </w:r>
+            <w:proofErr w:type="spellStart"/>
+            <w:r>
+              <w:rPr>
+                <w:rFonts w:cs="Calibri"/>
+              </w:rPr>
+              <w:t>Quedate</w:t>
+            </w:r>
+            <w:proofErr w:type="spellEnd"/>
+            <w:r>
+              <w:rPr>
+                <w:rFonts w:cs="Calibri"/>
+              </w:rPr>
+              <w:t xml:space="preserve"> con esto:</w:t>
             </w:r>
           </w:p>
           <w:tbl>
@@ -2321,7 +2518,25 @@
                       <w:b/>
                       <w:sz w:val="20"/>
                     </w:rPr>
-                    <w:t>¿El bloqueo molesta?</w:t>
+                    <w:t xml:space="preserve">¿El </w:t>
+                  </w:r>
+                  <w:proofErr w:type="gramStart"/>
+                  <w:r>
+                    <w:rPr>
+                      <w:rFonts w:cs="Calibri"/>
+                      <w:b/>
+                      <w:sz w:val="20"/>
+                    </w:rPr>
+                    <w:t>bloqueo molesta</w:t>
+                  </w:r>
+                  <w:proofErr w:type="gramEnd"/>
+                  <w:r>
+                    <w:rPr>
+                      <w:rFonts w:cs="Calibri"/>
+                      <w:b/>
+                      <w:sz w:val="20"/>
+                    </w:rPr>
+                    <w:t>?</w:t>
                   </w:r>
                 </w:p>
               </w:tc>
@@ -2411,8 +2626,17 @@
                       <w:rFonts w:cs="Calibri"/>
                       <w:sz w:val="20"/>
                     </w:rPr>
-                    <w:t xml:space="preserve"> Se libera mientras esperás</w:t>
+                    <w:t xml:space="preserve"> Se libera mientras </w:t>
                   </w:r>
+                  <w:proofErr w:type="spellStart"/>
+                  <w:r>
+                    <w:rPr>
+                      <w:rFonts w:cs="Calibri"/>
+                      <w:sz w:val="20"/>
+                    </w:rPr>
+                    <w:t>esperás</w:t>
+                  </w:r>
+                  <w:proofErr w:type="spellEnd"/>
                 </w:p>
               </w:tc>
               <w:tc>
@@ -2429,6 +2653,7 @@
                       <w:sz w:val="20"/>
                     </w:rPr>
                   </w:pPr>
+                  <w:proofErr w:type="spellStart"/>
                   <w:r>
                     <w:rPr>
                       <w:rFonts w:cs="Calibri"/>
@@ -2436,6 +2661,7 @@
                     </w:rPr>
                     <w:t>Corrutinas</w:t>
                   </w:r>
+                  <w:proofErr w:type="spellEnd"/>
                 </w:p>
               </w:tc>
             </w:tr>
@@ -2571,12 +2797,21 @@
               </w:rPr>
               <w:t xml:space="preserve">Y ahí está el caso interesante del TPI: </w:t>
             </w:r>
+            <w:proofErr w:type="spellStart"/>
             <w:r>
               <w:rPr>
                 <w:rFonts w:cs="Calibri"/>
                 <w:b/>
               </w:rPr>
-              <w:t>bcrypt es de la segunda fila.</w:t>
+              <w:t>bcrypt</w:t>
+            </w:r>
+            <w:proofErr w:type="spellEnd"/>
+            <w:r>
+              <w:rPr>
+                <w:rFonts w:cs="Calibri"/>
+                <w:b/>
+              </w:rPr>
+              <w:t xml:space="preserve"> es de la segunda fila.</w:t>
             </w:r>
             <w:r>
               <w:rPr>
@@ -2666,7 +2901,21 @@
         <w:rPr>
           <w:rFonts w:ascii="Calibri" w:hAnsi="Calibri" w:cs="Calibri"/>
         </w:rPr>
-        <w:t xml:space="preserve"> las corrutinas que esperaban esas operaciones.</w:t>
+        <w:t xml:space="preserve"> las </w:t>
+      </w:r>
+      <w:proofErr w:type="spellStart"/>
+      <w:r>
+        <w:rPr>
+          <w:rFonts w:ascii="Calibri" w:hAnsi="Calibri" w:cs="Calibri"/>
+        </w:rPr>
+        <w:t>corrutinas</w:t>
+      </w:r>
+      <w:proofErr w:type="spellEnd"/>
+      <w:r>
+        <w:rPr>
+          <w:rFonts w:ascii="Calibri" w:hAnsi="Calibri" w:cs="Calibri"/>
+        </w:rPr>
+        <w:t xml:space="preserve"> que esperaban esas operaciones.</w:t>
       </w:r>
     </w:p>
     <w:p>
@@ -2795,14 +3044,24 @@
         <w:t>"hasta su próximo punto de cesión"</w:t>
       </w:r>
       <w:r>
-        <w:t xml:space="preserve">. Si una corrutina no llega a un </w:t>
-      </w:r>
+        <w:t xml:space="preserve">. Si una </w:t>
+      </w:r>
+      <w:proofErr w:type="spellStart"/>
+      <w:r>
+        <w:t>corrutina</w:t>
+      </w:r>
+      <w:proofErr w:type="spellEnd"/>
+      <w:r>
+        <w:t xml:space="preserve"> no llega a un </w:t>
+      </w:r>
+      <w:proofErr w:type="spellStart"/>
       <w:r>
         <w:rPr>
           <w:rStyle w:val="Cdigoenlnea"/>
         </w:rPr>
         <w:t>await</w:t>
       </w:r>
+      <w:proofErr w:type="spellEnd"/>
       <w:r>
         <w:t>, el paso 3 no termina, y el bucle nunca vuelve al paso 1. Nadie más es atendido.</w:t>
       </w:r>
@@ -2824,11 +3083,124 @@
       </w:r>
       <w:r>
         <w:br/>
-        <w:t>async def obtener_pedido(pedido_id: int, uow: UnitOfWork = Depends(get_uow)):</w:t>
+      </w:r>
+      <w:proofErr w:type="spellStart"/>
+      <w:r>
+        <w:t>async</w:t>
+      </w:r>
+      <w:proofErr w:type="spellEnd"/>
+      <w:r>
+        <w:t xml:space="preserve"> </w:t>
+      </w:r>
+      <w:proofErr w:type="spellStart"/>
+      <w:r>
+        <w:t>def</w:t>
+      </w:r>
+      <w:proofErr w:type="spellEnd"/>
+      <w:r>
+        <w:t xml:space="preserve"> </w:t>
+      </w:r>
+      <w:proofErr w:type="spellStart"/>
+      <w:r>
+        <w:t>obtener_</w:t>
+      </w:r>
+      <w:proofErr w:type="gramStart"/>
+      <w:r>
+        <w:t>pedido</w:t>
+      </w:r>
+      <w:proofErr w:type="spellEnd"/>
+      <w:r>
+        <w:t>(</w:t>
+      </w:r>
+      <w:proofErr w:type="spellStart"/>
+      <w:proofErr w:type="gramEnd"/>
+      <w:r>
+        <w:t>pedido_id</w:t>
+      </w:r>
+      <w:proofErr w:type="spellEnd"/>
+      <w:r>
+        <w:t xml:space="preserve">: </w:t>
+      </w:r>
+      <w:proofErr w:type="spellStart"/>
+      <w:r>
+        <w:t>int</w:t>
+      </w:r>
+      <w:proofErr w:type="spellEnd"/>
+      <w:r>
+        <w:t xml:space="preserve">, </w:t>
+      </w:r>
+      <w:proofErr w:type="spellStart"/>
+      <w:r>
+        <w:t>uow</w:t>
+      </w:r>
+      <w:proofErr w:type="spellEnd"/>
+      <w:r>
+        <w:t xml:space="preserve">: </w:t>
+      </w:r>
+      <w:proofErr w:type="spellStart"/>
+      <w:r>
+        <w:t>UnitOfWork</w:t>
+      </w:r>
+      <w:proofErr w:type="spellEnd"/>
+      <w:r>
+        <w:t xml:space="preserve"> = </w:t>
+      </w:r>
+      <w:proofErr w:type="spellStart"/>
+      <w:r>
+        <w:t>Depends</w:t>
+      </w:r>
+      <w:proofErr w:type="spellEnd"/>
+      <w:r>
+        <w:t>(</w:t>
+      </w:r>
+      <w:proofErr w:type="spellStart"/>
+      <w:r>
+        <w:t>get_uow</w:t>
+      </w:r>
+      <w:proofErr w:type="spellEnd"/>
+      <w:r>
+        <w:t>)):</w:t>
       </w:r>
       <w:r>
         <w:br/>
-        <w:t xml:space="preserve">    pedido = await uow.pedidos.obtener(pedido_id)      # </w:t>
+        <w:t xml:space="preserve">    pedido = </w:t>
+      </w:r>
+      <w:proofErr w:type="spellStart"/>
+      <w:r>
+        <w:t>await</w:t>
+      </w:r>
+      <w:proofErr w:type="spellEnd"/>
+      <w:r>
+        <w:t xml:space="preserve"> </w:t>
+      </w:r>
+      <w:proofErr w:type="spellStart"/>
+      <w:proofErr w:type="gramStart"/>
+      <w:r>
+        <w:t>uow.pedidos</w:t>
+      </w:r>
+      <w:proofErr w:type="gramEnd"/>
+      <w:r>
+        <w:t>.obtener</w:t>
+      </w:r>
+      <w:proofErr w:type="spellEnd"/>
+      <w:r>
+        <w:t>(</w:t>
+      </w:r>
+      <w:proofErr w:type="spellStart"/>
+      <w:r>
+        <w:t>pedido_</w:t>
+      </w:r>
+      <w:proofErr w:type="gramStart"/>
+      <w:r>
+        <w:t>id</w:t>
+      </w:r>
+      <w:proofErr w:type="spellEnd"/>
+      <w:r>
+        <w:t xml:space="preserve">)   </w:t>
+      </w:r>
+      <w:proofErr w:type="gramEnd"/>
+      <w:r>
+        <w:t xml:space="preserve">   # </w:t>
       </w:r>
       <w:r>
         <w:rPr>
@@ -2841,7 +3213,49 @@
       </w:r>
       <w:r>
         <w:br/>
-        <w:t xml:space="preserve">    usuario = await uow.usuarios.obtener(pedido.usuario_id)  # </w:t>
+        <w:t xml:space="preserve">    usuario = </w:t>
+      </w:r>
+      <w:proofErr w:type="spellStart"/>
+      <w:r>
+        <w:t>await</w:t>
+      </w:r>
+      <w:proofErr w:type="spellEnd"/>
+      <w:r>
+        <w:t xml:space="preserve"> </w:t>
+      </w:r>
+      <w:proofErr w:type="spellStart"/>
+      <w:proofErr w:type="gramStart"/>
+      <w:r>
+        <w:t>uow.usuarios</w:t>
+      </w:r>
+      <w:proofErr w:type="gramEnd"/>
+      <w:r>
+        <w:t>.obtener</w:t>
+      </w:r>
+      <w:proofErr w:type="spellEnd"/>
+      <w:r>
+        <w:t>(</w:t>
+      </w:r>
+      <w:proofErr w:type="spellStart"/>
+      <w:proofErr w:type="gramStart"/>
+      <w:r>
+        <w:t>pedido.usuario</w:t>
+      </w:r>
+      <w:proofErr w:type="gramEnd"/>
+      <w:r>
+        <w:t>_</w:t>
+      </w:r>
+      <w:proofErr w:type="gramStart"/>
+      <w:r>
+        <w:t>id</w:t>
+      </w:r>
+      <w:proofErr w:type="spellEnd"/>
+      <w:r>
+        <w:t>)  #</w:t>
+      </w:r>
+      <w:proofErr w:type="gramEnd"/>
+      <w:r>
+        <w:t xml:space="preserve"> </w:t>
       </w:r>
       <w:r>
         <w:rPr>
@@ -2854,7 +3268,39 @@
       </w:r>
       <w:r>
         <w:br/>
-        <w:t xml:space="preserve">    return armar_respuesta(pedido, usuario)            # </w:t>
+        <w:t xml:space="preserve">    </w:t>
+      </w:r>
+      <w:proofErr w:type="spellStart"/>
+      <w:r>
+        <w:t>return</w:t>
+      </w:r>
+      <w:proofErr w:type="spellEnd"/>
+      <w:r>
+        <w:t xml:space="preserve"> </w:t>
+      </w:r>
+      <w:proofErr w:type="spellStart"/>
+      <w:r>
+        <w:t>armar_</w:t>
+      </w:r>
+      <w:proofErr w:type="gramStart"/>
+      <w:r>
+        <w:t>respuesta</w:t>
+      </w:r>
+      <w:proofErr w:type="spellEnd"/>
+      <w:r>
+        <w:t>(</w:t>
+      </w:r>
+      <w:proofErr w:type="gramEnd"/>
+      <w:r>
+        <w:t xml:space="preserve">pedido, </w:t>
+      </w:r>
+      <w:proofErr w:type="gramStart"/>
+      <w:r>
+        <w:t xml:space="preserve">usuario)   </w:t>
+      </w:r>
+      <w:proofErr w:type="gramEnd"/>
+      <w:r>
+        <w:t xml:space="preserve">         # </w:t>
       </w:r>
       <w:r>
         <w:rPr>
@@ -2871,7 +3317,15 @@
         <w:pStyle w:val="Cuerpo"/>
       </w:pPr>
       <w:r>
-        <w:t xml:space="preserve">En ① la corrutina le pide a la base de datos y </w:t>
+        <w:t xml:space="preserve">En ① la </w:t>
+      </w:r>
+      <w:proofErr w:type="spellStart"/>
+      <w:r>
+        <w:t>corrutina</w:t>
+      </w:r>
+      <w:proofErr w:type="spellEnd"/>
+      <w:r>
+        <w:t xml:space="preserve"> le pide a la base de datos y </w:t>
       </w:r>
       <w:r>
         <w:rPr>
@@ -2880,7 +3334,15 @@
         <w:t>cede el control</w:t>
       </w:r>
       <w:r>
-        <w:t>. El bucle, en ese momento, atiende otras peticiones. Cuando la base responde, la corrutina se reanuda exactamente en ese punto. Lo mismo en ②. En ③ no hay cesión, y está bien: es trabajo de milisegundos.</w:t>
+        <w:t xml:space="preserve">. El bucle, en ese momento, atiende otras peticiones. Cuando la base responde, la </w:t>
+      </w:r>
+      <w:proofErr w:type="spellStart"/>
+      <w:r>
+        <w:t>corrutina</w:t>
+      </w:r>
+      <w:proofErr w:type="spellEnd"/>
+      <w:r>
+        <w:t xml:space="preserve"> se reanuda exactamente en ese punto. Lo mismo en ②. En ③ no hay cesión, y está bien: es trabajo de milisegundos.</w:t>
       </w:r>
     </w:p>
     <w:p>
@@ -2901,15 +3363,99 @@
       </w:r>
       <w:r>
         <w:br/>
-        <w:t>async def obtener_pedido(pedido_id: int):</w:t>
+      </w:r>
+      <w:proofErr w:type="spellStart"/>
+      <w:r>
+        <w:t>async</w:t>
+      </w:r>
+      <w:proofErr w:type="spellEnd"/>
+      <w:r>
+        <w:t xml:space="preserve"> </w:t>
+      </w:r>
+      <w:proofErr w:type="spellStart"/>
+      <w:r>
+        <w:t>def</w:t>
+      </w:r>
+      <w:proofErr w:type="spellEnd"/>
+      <w:r>
+        <w:t xml:space="preserve"> </w:t>
+      </w:r>
+      <w:proofErr w:type="spellStart"/>
+      <w:r>
+        <w:t>obtener_</w:t>
+      </w:r>
+      <w:proofErr w:type="gramStart"/>
+      <w:r>
+        <w:t>pedido</w:t>
+      </w:r>
+      <w:proofErr w:type="spellEnd"/>
+      <w:r>
+        <w:t>(</w:t>
+      </w:r>
+      <w:proofErr w:type="spellStart"/>
+      <w:proofErr w:type="gramEnd"/>
+      <w:r>
+        <w:t>pedido_id</w:t>
+      </w:r>
+      <w:proofErr w:type="spellEnd"/>
+      <w:r>
+        <w:t xml:space="preserve">: </w:t>
+      </w:r>
+      <w:proofErr w:type="spellStart"/>
+      <w:r>
+        <w:t>int</w:t>
+      </w:r>
+      <w:proofErr w:type="spellEnd"/>
+      <w:r>
+        <w:t>):</w:t>
       </w:r>
       <w:r>
         <w:br/>
-        <w:t xml:space="preserve">    pedido = requests.get(f"{URL}/pedidos/{pedido_id}").json()   # NO cede</w:t>
+        <w:t xml:space="preserve">    pedido = </w:t>
+      </w:r>
+      <w:proofErr w:type="spellStart"/>
+      <w:r>
+        <w:t>requests.get</w:t>
+      </w:r>
+      <w:proofErr w:type="spellEnd"/>
+      <w:r>
+        <w:t>(f"{URL}/pedidos/{</w:t>
+      </w:r>
+      <w:proofErr w:type="spellStart"/>
+      <w:r>
+        <w:t>pedido_id</w:t>
+      </w:r>
+      <w:proofErr w:type="spellEnd"/>
+      <w:r>
+        <w:t>}"</w:t>
+      </w:r>
+      <w:proofErr w:type="gramStart"/>
+      <w:r>
+        <w:t>).</w:t>
+      </w:r>
+      <w:proofErr w:type="spellStart"/>
+      <w:r>
+        <w:t>json</w:t>
+      </w:r>
+      <w:proofErr w:type="spellEnd"/>
+      <w:r>
+        <w:t xml:space="preserve">()   </w:t>
+      </w:r>
+      <w:proofErr w:type="gramEnd"/>
+      <w:r>
+        <w:t># NO cede</w:t>
       </w:r>
       <w:r>
         <w:br/>
-        <w:t xml:space="preserve">    return pedido</w:t>
+        <w:t xml:space="preserve">    </w:t>
+      </w:r>
+      <w:proofErr w:type="spellStart"/>
+      <w:r>
+        <w:t>return</w:t>
+      </w:r>
+      <w:proofErr w:type="spellEnd"/>
+      <w:r>
+        <w:t xml:space="preserve"> pedido</w:t>
       </w:r>
     </w:p>
     <w:p>
@@ -2919,12 +3465,14 @@
       <w:r>
         <w:t xml:space="preserve">Esa línea usa un cliente sincrónico. No hay </w:t>
       </w:r>
+      <w:proofErr w:type="spellStart"/>
       <w:r>
         <w:rPr>
           <w:rStyle w:val="Cdigoenlnea"/>
         </w:rPr>
         <w:t>await</w:t>
       </w:r>
+      <w:proofErr w:type="spellEnd"/>
       <w:r>
         <w:t xml:space="preserve">, así que </w:t>
       </w:r>
@@ -2999,12 +3547,21 @@
               <w:spacing w:after="100"/>
               <w:jc w:val="left"/>
             </w:pPr>
+            <w:proofErr w:type="spellStart"/>
             <w:r>
               <w:rPr>
                 <w:b/>
               </w:rPr>
-              <w:t xml:space="preserve">Buscá los </w:t>
+              <w:t>Buscá</w:t>
             </w:r>
+            <w:proofErr w:type="spellEnd"/>
+            <w:r>
+              <w:rPr>
+                <w:b/>
+              </w:rPr>
+              <w:t xml:space="preserve"> los </w:t>
+            </w:r>
+            <w:proofErr w:type="spellStart"/>
             <w:r>
               <w:rPr>
                 <w:rStyle w:val="Cdigoenlnea"/>
@@ -3012,6 +3569,7 @@
               </w:rPr>
               <w:t>await</w:t>
             </w:r>
+            <w:proofErr w:type="spellEnd"/>
             <w:r>
               <w:rPr>
                 <w:b/>
@@ -3028,12 +3586,14 @@
             <w:r>
               <w:t xml:space="preserve">Entre dos </w:t>
             </w:r>
+            <w:proofErr w:type="spellStart"/>
             <w:r>
               <w:rPr>
                 <w:rStyle w:val="Cdigoenlnea"/>
               </w:rPr>
               <w:t>await</w:t>
             </w:r>
+            <w:proofErr w:type="spellEnd"/>
             <w:r>
               <w:t xml:space="preserve"> consecutivos, tu código corre </w:t>
             </w:r>
@@ -3060,14 +3620,24 @@
               <w:t>La buena:</w:t>
             </w:r>
             <w:r>
-              <w:t xml:space="preserve"> no necesitás candados para proteger una variable compartida entre dos líneas sin </w:t>
+              <w:t xml:space="preserve"> no </w:t>
             </w:r>
+            <w:proofErr w:type="spellStart"/>
+            <w:r>
+              <w:t>necesitás</w:t>
+            </w:r>
+            <w:proofErr w:type="spellEnd"/>
+            <w:r>
+              <w:t xml:space="preserve"> candados para proteger una variable compartida entre dos líneas sin </w:t>
+            </w:r>
+            <w:proofErr w:type="spellStart"/>
             <w:r>
               <w:rPr>
                 <w:rStyle w:val="Cdigoenlnea"/>
               </w:rPr>
               <w:t>await</w:t>
             </w:r>
+            <w:proofErr w:type="spellEnd"/>
             <w:r>
               <w:t>. Con hilos sí los necesitarías, porque el sistema operativo te puede sacar en cualquier momento.</w:t>
             </w:r>
@@ -3087,12 +3657,14 @@
             <w:r>
               <w:t xml:space="preserve"> si entre dos </w:t>
             </w:r>
+            <w:proofErr w:type="spellStart"/>
             <w:r>
               <w:rPr>
                 <w:rStyle w:val="Cdigoenlnea"/>
               </w:rPr>
               <w:t>await</w:t>
             </w:r>
+            <w:proofErr w:type="spellEnd"/>
             <w:r>
               <w:t xml:space="preserve"> hay algo que tarda, </w:t>
             </w:r>
@@ -3121,6 +3693,7 @@
               </w:rPr>
               <w:t xml:space="preserve">una función </w:t>
             </w:r>
+            <w:proofErr w:type="spellStart"/>
             <w:r>
               <w:rPr>
                 <w:rStyle w:val="Cdigoenlnea"/>
@@ -3128,12 +3701,14 @@
               </w:rPr>
               <w:t>async</w:t>
             </w:r>
+            <w:proofErr w:type="spellEnd"/>
             <w:r>
               <w:rPr>
                 <w:b/>
               </w:rPr>
               <w:t xml:space="preserve"> sin ningún </w:t>
             </w:r>
+            <w:proofErr w:type="spellStart"/>
             <w:r>
               <w:rPr>
                 <w:rStyle w:val="Cdigoenlnea"/>
@@ -3141,6 +3716,7 @@
               </w:rPr>
               <w:t>await</w:t>
             </w:r>
+            <w:proofErr w:type="spellEnd"/>
             <w:r>
               <w:rPr>
                 <w:b/>
@@ -3150,12 +3726,14 @@
             <w:r>
               <w:t xml:space="preserve"> O no hace entrada y salida —y entonces no necesitaba ser </w:t>
             </w:r>
+            <w:proofErr w:type="spellStart"/>
             <w:r>
               <w:rPr>
                 <w:rStyle w:val="Cdigoenlnea"/>
               </w:rPr>
               <w:t>async</w:t>
             </w:r>
+            <w:proofErr w:type="spellEnd"/>
             <w:r>
               <w:t>— o la hace de forma bloqueante, que es el problema de este capítulo entero.</w:t>
             </w:r>
@@ -3189,7 +3767,21 @@
         <w:rPr>
           <w:b w:val="0"/>
         </w:rPr>
-        <w:t>3.5. Corrutinas y tareas</w:t>
+        <w:t xml:space="preserve">3.5. </w:t>
+      </w:r>
+      <w:proofErr w:type="spellStart"/>
+      <w:r>
+        <w:rPr>
+          <w:b w:val="0"/>
+        </w:rPr>
+        <w:t>Corrutinas</w:t>
+      </w:r>
+      <w:proofErr w:type="spellEnd"/>
+      <w:r>
+        <w:rPr>
+          <w:b w:val="0"/>
+        </w:rPr>
+        <w:t xml:space="preserve"> y tareas</w:t>
       </w:r>
       <w:bookmarkEnd w:id="6"/>
     </w:p>
@@ -3200,12 +3792,28 @@
       <w:r>
         <w:t xml:space="preserve">Una función declarada con </w:t>
       </w:r>
+      <w:proofErr w:type="spellStart"/>
       <w:r>
         <w:rPr>
           <w:rStyle w:val="Cdigoenlnea"/>
         </w:rPr>
-        <w:t>async def</w:t>
-      </w:r>
+        <w:t>async</w:t>
+      </w:r>
+      <w:proofErr w:type="spellEnd"/>
+      <w:r>
+        <w:rPr>
+          <w:rStyle w:val="Cdigoenlnea"/>
+        </w:rPr>
+        <w:t xml:space="preserve"> </w:t>
+      </w:r>
+      <w:proofErr w:type="spellStart"/>
+      <w:r>
+        <w:rPr>
+          <w:rStyle w:val="Cdigoenlnea"/>
+        </w:rPr>
+        <w:t>def</w:t>
+      </w:r>
+      <w:proofErr w:type="spellEnd"/>
       <w:r>
         <w:t xml:space="preserve"> es una </w:t>
       </w:r>
@@ -3213,8 +3821,16 @@
         <w:rPr>
           <w:b/>
         </w:rPr>
-        <w:t>función corrutina</w:t>
-      </w:r>
+        <w:t xml:space="preserve">función </w:t>
+      </w:r>
+      <w:proofErr w:type="spellStart"/>
+      <w:r>
+        <w:rPr>
+          <w:b/>
+        </w:rPr>
+        <w:t>corrutina</w:t>
+      </w:r>
+      <w:proofErr w:type="spellEnd"/>
       <w:r>
         <w:t xml:space="preserve">. Llamarla </w:t>
       </w:r>
@@ -3233,11 +3849,56 @@
         <w:pStyle w:val="Bloquedecdigo"/>
       </w:pPr>
       <w:r>
-        <w:t>resultado = calcular_total(pedido)      # NO se ejecutó: es un objeto corrutina</w:t>
-      </w:r>
+        <w:t xml:space="preserve">resultado = </w:t>
+      </w:r>
+      <w:proofErr w:type="spellStart"/>
+      <w:r>
+        <w:t>calcular_total</w:t>
+      </w:r>
+      <w:proofErr w:type="spellEnd"/>
+      <w:r>
+        <w:t>(</w:t>
+      </w:r>
+      <w:proofErr w:type="gramStart"/>
+      <w:r>
+        <w:t xml:space="preserve">pedido)   </w:t>
+      </w:r>
+      <w:proofErr w:type="gramEnd"/>
+      <w:r>
+        <w:t xml:space="preserve">   # NO se ejecutó: es un objeto </w:t>
+      </w:r>
+      <w:proofErr w:type="spellStart"/>
+      <w:r>
+        <w:t>corrutina</w:t>
+      </w:r>
+      <w:proofErr w:type="spellEnd"/>
       <w:r>
         <w:br/>
-        <w:t>resultado = await calcular_total(pedido)  # ahora sí</w:t>
+        <w:t xml:space="preserve">resultado = </w:t>
+      </w:r>
+      <w:proofErr w:type="spellStart"/>
+      <w:r>
+        <w:t>await</w:t>
+      </w:r>
+      <w:proofErr w:type="spellEnd"/>
+      <w:r>
+        <w:t xml:space="preserve"> </w:t>
+      </w:r>
+      <w:proofErr w:type="spellStart"/>
+      <w:r>
+        <w:t>calcular_total</w:t>
+      </w:r>
+      <w:proofErr w:type="spellEnd"/>
+      <w:r>
+        <w:t>(</w:t>
+      </w:r>
+      <w:proofErr w:type="gramStart"/>
+      <w:r>
+        <w:t>pedido)  #</w:t>
+      </w:r>
+      <w:proofErr w:type="gramEnd"/>
+      <w:r>
+        <w:t xml:space="preserve"> ahora sí</w:t>
       </w:r>
     </w:p>
     <w:p>
@@ -3287,27 +3948,165 @@
       <w:pPr>
         <w:pStyle w:val="Bloquedecdigo"/>
       </w:pPr>
-      <w:r>
-        <w:t>async with asyncio.TaskGroup() as tg:</w:t>
+      <w:proofErr w:type="spellStart"/>
+      <w:r>
+        <w:t>async</w:t>
+      </w:r>
+      <w:proofErr w:type="spellEnd"/>
+      <w:r>
+        <w:t xml:space="preserve"> </w:t>
+      </w:r>
+      <w:proofErr w:type="spellStart"/>
+      <w:r>
+        <w:t>with</w:t>
+      </w:r>
+      <w:proofErr w:type="spellEnd"/>
+      <w:r>
+        <w:t xml:space="preserve"> </w:t>
+      </w:r>
+      <w:proofErr w:type="spellStart"/>
+      <w:proofErr w:type="gramStart"/>
+      <w:r>
+        <w:t>asyncio.TaskGroup</w:t>
+      </w:r>
+      <w:proofErr w:type="spellEnd"/>
+      <w:proofErr w:type="gramEnd"/>
+      <w:r>
+        <w:t xml:space="preserve">() as </w:t>
+      </w:r>
+      <w:proofErr w:type="spellStart"/>
+      <w:r>
+        <w:t>tg</w:t>
+      </w:r>
+      <w:proofErr w:type="spellEnd"/>
+      <w:r>
+        <w:t>:</w:t>
       </w:r>
       <w:r>
         <w:br/>
-        <w:t xml:space="preserve">    t_productos = tg.create_task(listar_productos())</w:t>
+        <w:t xml:space="preserve">    </w:t>
+      </w:r>
+      <w:proofErr w:type="spellStart"/>
+      <w:r>
+        <w:t>t_productos</w:t>
+      </w:r>
+      <w:proofErr w:type="spellEnd"/>
+      <w:r>
+        <w:t xml:space="preserve"> = </w:t>
+      </w:r>
+      <w:proofErr w:type="spellStart"/>
+      <w:proofErr w:type="gramStart"/>
+      <w:r>
+        <w:t>tg.create</w:t>
+      </w:r>
+      <w:proofErr w:type="gramEnd"/>
+      <w:r>
+        <w:t>_task</w:t>
+      </w:r>
+      <w:proofErr w:type="spellEnd"/>
+      <w:r>
+        <w:t>(</w:t>
+      </w:r>
+      <w:proofErr w:type="spellStart"/>
+      <w:r>
+        <w:t>listar_</w:t>
+      </w:r>
+      <w:proofErr w:type="gramStart"/>
+      <w:r>
+        <w:t>productos</w:t>
+      </w:r>
+      <w:proofErr w:type="spellEnd"/>
+      <w:r>
+        <w:t>(</w:t>
+      </w:r>
+      <w:proofErr w:type="gramEnd"/>
+      <w:r>
+        <w:t>))</w:t>
       </w:r>
       <w:r>
         <w:br/>
-        <w:t xml:space="preserve">    t_categorias = tg.create_task(listar_categorias())</w:t>
+        <w:t xml:space="preserve">    </w:t>
+      </w:r>
+      <w:proofErr w:type="spellStart"/>
+      <w:r>
+        <w:t>t_categorias</w:t>
+      </w:r>
+      <w:proofErr w:type="spellEnd"/>
+      <w:r>
+        <w:t xml:space="preserve"> = </w:t>
+      </w:r>
+      <w:proofErr w:type="spellStart"/>
+      <w:proofErr w:type="gramStart"/>
+      <w:r>
+        <w:t>tg.create</w:t>
+      </w:r>
+      <w:proofErr w:type="gramEnd"/>
+      <w:r>
+        <w:t>_task</w:t>
+      </w:r>
+      <w:proofErr w:type="spellEnd"/>
+      <w:r>
+        <w:t>(</w:t>
+      </w:r>
+      <w:proofErr w:type="spellStart"/>
+      <w:r>
+        <w:t>listar_</w:t>
+      </w:r>
+      <w:proofErr w:type="gramStart"/>
+      <w:r>
+        <w:t>categorias</w:t>
+      </w:r>
+      <w:proofErr w:type="spellEnd"/>
+      <w:r>
+        <w:t>(</w:t>
+      </w:r>
+      <w:proofErr w:type="gramEnd"/>
+      <w:r>
+        <w:t>))</w:t>
       </w:r>
       <w:r>
         <w:br/>
       </w:r>
       <w:r>
         <w:br/>
-        <w:t>productos = t_productos.result()</w:t>
+        <w:t xml:space="preserve">productos = </w:t>
+      </w:r>
+      <w:proofErr w:type="spellStart"/>
+      <w:r>
+        <w:t>t_</w:t>
+      </w:r>
+      <w:proofErr w:type="gramStart"/>
+      <w:r>
+        <w:t>productos.result</w:t>
+      </w:r>
+      <w:proofErr w:type="spellEnd"/>
+      <w:proofErr w:type="gramEnd"/>
+      <w:r>
+        <w:t>()</w:t>
       </w:r>
       <w:r>
         <w:br/>
-        <w:t>categorias = t_categorias.result()</w:t>
+      </w:r>
+      <w:proofErr w:type="spellStart"/>
+      <w:r>
+        <w:t>categorias</w:t>
+      </w:r>
+      <w:proofErr w:type="spellEnd"/>
+      <w:r>
+        <w:t xml:space="preserve"> = </w:t>
+      </w:r>
+      <w:proofErr w:type="spellStart"/>
+      <w:r>
+        <w:t>t_</w:t>
+      </w:r>
+      <w:proofErr w:type="gramStart"/>
+      <w:r>
+        <w:t>categorias.result</w:t>
+      </w:r>
+      <w:proofErr w:type="spellEnd"/>
+      <w:proofErr w:type="gramEnd"/>
+      <w:r>
+        <w:t>()</w:t>
       </w:r>
     </w:p>
     <w:p>
@@ -3344,11 +4143,19 @@
       <w:r>
         <w:t xml:space="preserve"> a quien abrió el grupo, agrupados si fueron varios —para eso existe la sintaxis </w:t>
       </w:r>
+      <w:proofErr w:type="spellStart"/>
       <w:r>
         <w:rPr>
           <w:rStyle w:val="Cdigoenlnea"/>
         </w:rPr>
-        <w:t>except*</w:t>
+        <w:t>except</w:t>
+      </w:r>
+      <w:proofErr w:type="spellEnd"/>
+      <w:r>
+        <w:rPr>
+          <w:rStyle w:val="Cdigoenlnea"/>
+        </w:rPr>
+        <w:t>*</w:t>
       </w:r>
       <w:r>
         <w:t>—.</w:t>
@@ -3370,12 +4177,14 @@
       <w:r>
         <w:t xml:space="preserve"> Encadenarlas con dos </w:t>
       </w:r>
+      <w:proofErr w:type="spellStart"/>
       <w:r>
         <w:rPr>
           <w:rStyle w:val="Cdigoenlnea"/>
         </w:rPr>
         <w:t>await</w:t>
       </w:r>
+      <w:proofErr w:type="spellEnd"/>
       <w:r>
         <w:t xml:space="preserve"> seguidos las serializa sin motivo, y el tiempo total pasa a ser la suma en lugar del máximo.</w:t>
       </w:r>
@@ -3460,11 +4269,66 @@
             </w:r>
             <w:r>
               <w:br/>
-              <w:t>productos = await listar_productos()</w:t>
+              <w:t xml:space="preserve">productos = </w:t>
+            </w:r>
+            <w:proofErr w:type="spellStart"/>
+            <w:r>
+              <w:t>await</w:t>
+            </w:r>
+            <w:proofErr w:type="spellEnd"/>
+            <w:r>
+              <w:t xml:space="preserve"> </w:t>
+            </w:r>
+            <w:proofErr w:type="spellStart"/>
+            <w:r>
+              <w:t>listar_</w:t>
+            </w:r>
+            <w:proofErr w:type="gramStart"/>
+            <w:r>
+              <w:t>productos</w:t>
+            </w:r>
+            <w:proofErr w:type="spellEnd"/>
+            <w:r>
+              <w:t>(</w:t>
+            </w:r>
+            <w:proofErr w:type="gramEnd"/>
+            <w:r>
+              <w:t>)</w:t>
             </w:r>
             <w:r>
               <w:br/>
-              <w:t>categorias = await listar_categorias()</w:t>
+            </w:r>
+            <w:proofErr w:type="spellStart"/>
+            <w:r>
+              <w:t>categorias</w:t>
+            </w:r>
+            <w:proofErr w:type="spellEnd"/>
+            <w:r>
+              <w:t xml:space="preserve"> = </w:t>
+            </w:r>
+            <w:proofErr w:type="spellStart"/>
+            <w:r>
+              <w:t>await</w:t>
+            </w:r>
+            <w:proofErr w:type="spellEnd"/>
+            <w:r>
+              <w:t xml:space="preserve"> </w:t>
+            </w:r>
+            <w:proofErr w:type="spellStart"/>
+            <w:r>
+              <w:t>listar_</w:t>
+            </w:r>
+            <w:proofErr w:type="gramStart"/>
+            <w:r>
+              <w:t>categorias</w:t>
+            </w:r>
+            <w:proofErr w:type="spellEnd"/>
+            <w:r>
+              <w:t>(</w:t>
+            </w:r>
+            <w:proofErr w:type="gramEnd"/>
+            <w:r>
+              <w:t>)</w:t>
             </w:r>
             <w:r>
               <w:br/>
@@ -3475,15 +4339,122 @@
             </w:r>
             <w:r>
               <w:br/>
-              <w:t>async with asyncio.TaskGroup() as tg:</w:t>
+            </w:r>
+            <w:proofErr w:type="spellStart"/>
+            <w:r>
+              <w:t>async</w:t>
+            </w:r>
+            <w:proofErr w:type="spellEnd"/>
+            <w:r>
+              <w:t xml:space="preserve"> </w:t>
+            </w:r>
+            <w:proofErr w:type="spellStart"/>
+            <w:r>
+              <w:t>with</w:t>
+            </w:r>
+            <w:proofErr w:type="spellEnd"/>
+            <w:r>
+              <w:t xml:space="preserve"> </w:t>
+            </w:r>
+            <w:proofErr w:type="spellStart"/>
+            <w:proofErr w:type="gramStart"/>
+            <w:r>
+              <w:t>asyncio.TaskGroup</w:t>
+            </w:r>
+            <w:proofErr w:type="spellEnd"/>
+            <w:proofErr w:type="gramEnd"/>
+            <w:r>
+              <w:t xml:space="preserve">() as </w:t>
+            </w:r>
+            <w:proofErr w:type="spellStart"/>
+            <w:r>
+              <w:t>tg</w:t>
+            </w:r>
+            <w:proofErr w:type="spellEnd"/>
+            <w:r>
+              <w:t>:</w:t>
             </w:r>
             <w:r>
               <w:br/>
-              <w:t xml:space="preserve">    tp = tg.create_task(listar_productos())</w:t>
+              <w:t xml:space="preserve">    </w:t>
+            </w:r>
+            <w:proofErr w:type="spellStart"/>
+            <w:r>
+              <w:t>tp</w:t>
+            </w:r>
+            <w:proofErr w:type="spellEnd"/>
+            <w:r>
+              <w:t xml:space="preserve"> = </w:t>
+            </w:r>
+            <w:proofErr w:type="spellStart"/>
+            <w:proofErr w:type="gramStart"/>
+            <w:r>
+              <w:t>tg.create</w:t>
+            </w:r>
+            <w:proofErr w:type="gramEnd"/>
+            <w:r>
+              <w:t>_task</w:t>
+            </w:r>
+            <w:proofErr w:type="spellEnd"/>
+            <w:r>
+              <w:t>(</w:t>
+            </w:r>
+            <w:proofErr w:type="spellStart"/>
+            <w:r>
+              <w:t>listar_</w:t>
+            </w:r>
+            <w:proofErr w:type="gramStart"/>
+            <w:r>
+              <w:t>productos</w:t>
+            </w:r>
+            <w:proofErr w:type="spellEnd"/>
+            <w:r>
+              <w:t>(</w:t>
+            </w:r>
+            <w:proofErr w:type="gramEnd"/>
+            <w:r>
+              <w:t>))</w:t>
             </w:r>
             <w:r>
               <w:br/>
-              <w:t xml:space="preserve">    tc = tg.create_task(listar_categorias())</w:t>
+              <w:t xml:space="preserve">    </w:t>
+            </w:r>
+            <w:proofErr w:type="spellStart"/>
+            <w:r>
+              <w:t>tc</w:t>
+            </w:r>
+            <w:proofErr w:type="spellEnd"/>
+            <w:r>
+              <w:t xml:space="preserve"> = </w:t>
+            </w:r>
+            <w:proofErr w:type="spellStart"/>
+            <w:proofErr w:type="gramStart"/>
+            <w:r>
+              <w:t>tg.create</w:t>
+            </w:r>
+            <w:proofErr w:type="gramEnd"/>
+            <w:r>
+              <w:t>_task</w:t>
+            </w:r>
+            <w:proofErr w:type="spellEnd"/>
+            <w:r>
+              <w:t>(</w:t>
+            </w:r>
+            <w:proofErr w:type="spellStart"/>
+            <w:r>
+              <w:t>listar_</w:t>
+            </w:r>
+            <w:proofErr w:type="gramStart"/>
+            <w:r>
+              <w:t>categorias</w:t>
+            </w:r>
+            <w:proofErr w:type="spellEnd"/>
+            <w:r>
+              <w:t>(</w:t>
+            </w:r>
+            <w:proofErr w:type="gramEnd"/>
+            <w:r>
+              <w:t>))</w:t>
             </w:r>
           </w:p>
           <w:p>
@@ -3512,7 +4483,15 @@
               <w:t>el código serializado no está mal escrito.</w:t>
             </w:r>
             <w:r>
-              <w:t xml:space="preserve"> Es perfectamente correcto, hace lo que dice y pasa cualquier test. Simplemente tarda el doble sin necesidad.</w:t>
+              <w:t xml:space="preserve"> Es perfectamente correcto, hace lo que dice y pasa </w:t>
+            </w:r>
+            <w:proofErr w:type="gramStart"/>
+            <w:r>
+              <w:t>cualquier test</w:t>
+            </w:r>
+            <w:proofErr w:type="gramEnd"/>
+            <w:r>
+              <w:t>. Simplemente tarda el doble sin necesidad.</w:t>
             </w:r>
           </w:p>
           <w:p>
@@ -3522,14 +4501,24 @@
               <w:jc w:val="left"/>
             </w:pPr>
             <w:r>
-              <w:t xml:space="preserve">La pregunta que te tenés que hacer en cada </w:t>
+              <w:t xml:space="preserve">La pregunta que te </w:t>
             </w:r>
+            <w:proofErr w:type="spellStart"/>
+            <w:r>
+              <w:t>tenés</w:t>
+            </w:r>
+            <w:proofErr w:type="spellEnd"/>
+            <w:r>
+              <w:t xml:space="preserve"> que hacer en cada </w:t>
+            </w:r>
+            <w:proofErr w:type="spellStart"/>
             <w:r>
               <w:rPr>
                 <w:rStyle w:val="Cdigoenlnea"/>
               </w:rPr>
               <w:t>await</w:t>
             </w:r>
+            <w:proofErr w:type="spellEnd"/>
             <w:r>
               <w:t xml:space="preserve"> es una sola: </w:t>
             </w:r>
@@ -3645,12 +4634,14 @@
       <w:r>
         <w:t xml:space="preserve">Las tres del sistema son </w:t>
       </w:r>
+      <w:proofErr w:type="spellStart"/>
       <w:r>
         <w:rPr>
           <w:b/>
         </w:rPr>
         <w:t>bcrypt</w:t>
       </w:r>
+      <w:proofErr w:type="spellEnd"/>
       <w:r>
         <w:t xml:space="preserve">, la </w:t>
       </w:r>
@@ -3672,11 +4663,33 @@
       <w:r>
         <w:t xml:space="preserve">; se ejecutan con </w:t>
       </w:r>
+      <w:proofErr w:type="spellStart"/>
       <w:r>
         <w:rPr>
           <w:rStyle w:val="Cdigoenlnea"/>
         </w:rPr>
-        <w:t>anyio.to_thread.run_sync()</w:t>
+        <w:t>anyio.to_thread.run_</w:t>
+      </w:r>
+      <w:proofErr w:type="gramStart"/>
+      <w:r>
+        <w:rPr>
+          <w:rStyle w:val="Cdigoenlnea"/>
+        </w:rPr>
+        <w:t>sync</w:t>
+      </w:r>
+      <w:proofErr w:type="spellEnd"/>
+      <w:r>
+        <w:rPr>
+          <w:rStyle w:val="Cdigoenlnea"/>
+        </w:rPr>
+        <w:t>(</w:t>
+      </w:r>
+      <w:proofErr w:type="gramEnd"/>
+      <w:r>
+        <w:rPr>
+          <w:rStyle w:val="Cdigoenlnea"/>
+        </w:rPr>
+        <w:t>)</w:t>
       </w:r>
       <w:r>
         <w:t>.</w:t>
@@ -3703,15 +4716,95 @@
       <w:pPr>
         <w:pStyle w:val="Bloquedecdigo"/>
       </w:pPr>
-      <w:r>
-        <w:t>from anyio import to_thread</w:t>
-      </w:r>
+      <w:proofErr w:type="spellStart"/>
+      <w:r>
+        <w:t>from</w:t>
+      </w:r>
+      <w:proofErr w:type="spellEnd"/>
+      <w:r>
+        <w:t xml:space="preserve"> </w:t>
+      </w:r>
+      <w:proofErr w:type="spellStart"/>
+      <w:r>
+        <w:t>anyio</w:t>
+      </w:r>
+      <w:proofErr w:type="spellEnd"/>
+      <w:r>
+        <w:t xml:space="preserve"> </w:t>
+      </w:r>
+      <w:proofErr w:type="spellStart"/>
+      <w:r>
+        <w:t>import</w:t>
+      </w:r>
+      <w:proofErr w:type="spellEnd"/>
+      <w:r>
+        <w:t xml:space="preserve"> </w:t>
+      </w:r>
+      <w:proofErr w:type="spellStart"/>
+      <w:r>
+        <w:t>to_thread</w:t>
+      </w:r>
+      <w:proofErr w:type="spellEnd"/>
       <w:r>
         <w:br/>
       </w:r>
       <w:r>
         <w:br/>
-        <w:t>hash_almacenado = await to_thread.run_sync(bcrypt.hashpw, password, salt)</w:t>
+      </w:r>
+      <w:proofErr w:type="spellStart"/>
+      <w:r>
+        <w:t>hash_almacenado</w:t>
+      </w:r>
+      <w:proofErr w:type="spellEnd"/>
+      <w:r>
+        <w:t xml:space="preserve"> = </w:t>
+      </w:r>
+      <w:proofErr w:type="spellStart"/>
+      <w:r>
+        <w:t>await</w:t>
+      </w:r>
+      <w:proofErr w:type="spellEnd"/>
+      <w:r>
+        <w:t xml:space="preserve"> </w:t>
+      </w:r>
+      <w:proofErr w:type="spellStart"/>
+      <w:r>
+        <w:t>to_thread.run_</w:t>
+      </w:r>
+      <w:proofErr w:type="gramStart"/>
+      <w:r>
+        <w:t>sync</w:t>
+      </w:r>
+      <w:proofErr w:type="spellEnd"/>
+      <w:r>
+        <w:t>(</w:t>
+      </w:r>
+      <w:proofErr w:type="spellStart"/>
+      <w:r>
+        <w:t>bcrypt.hashpw</w:t>
+      </w:r>
+      <w:proofErr w:type="spellEnd"/>
+      <w:proofErr w:type="gramEnd"/>
+      <w:r>
+        <w:t xml:space="preserve">, </w:t>
+      </w:r>
+      <w:proofErr w:type="spellStart"/>
+      <w:proofErr w:type="gramStart"/>
+      <w:r>
+        <w:t>password</w:t>
+      </w:r>
+      <w:proofErr w:type="spellEnd"/>
+      <w:proofErr w:type="gramEnd"/>
+      <w:r>
+        <w:t xml:space="preserve">, </w:t>
+      </w:r>
+      <w:proofErr w:type="spellStart"/>
+      <w:r>
+        <w:t>salt</w:t>
+      </w:r>
+      <w:proofErr w:type="spellEnd"/>
+      <w:r>
+        <w:t>)</w:t>
       </w:r>
     </w:p>
     <w:p>
@@ -3721,14 +4814,24 @@
       <w:r>
         <w:t xml:space="preserve">Esa línea sí tiene </w:t>
       </w:r>
+      <w:proofErr w:type="spellStart"/>
       <w:r>
         <w:rPr>
           <w:rStyle w:val="Cdigoenlnea"/>
         </w:rPr>
         <w:t>await</w:t>
       </w:r>
-      <w:r>
-        <w:t>: la corrutina cede mientras el trabajo ocurre en otro lado, y se reanuda cuando termina.</w:t>
+      <w:proofErr w:type="spellEnd"/>
+      <w:r>
+        <w:t xml:space="preserve">: la </w:t>
+      </w:r>
+      <w:proofErr w:type="spellStart"/>
+      <w:r>
+        <w:t>corrutina</w:t>
+      </w:r>
+      <w:proofErr w:type="spellEnd"/>
+      <w:r>
+        <w:t xml:space="preserve"> cede mientras el trabajo ocurre en otro lado, y se reanuda cuando termina.</w:t>
       </w:r>
     </w:p>
     <w:p>
@@ -3751,7 +4854,15 @@
         <w:t>EA-06.</w:t>
       </w:r>
       <w:r>
-        <w:t xml:space="preserve"> Ninguna corrutina hace trabajo de CPU de </w:t>
+        <w:t xml:space="preserve"> Ninguna </w:t>
+      </w:r>
+      <w:proofErr w:type="spellStart"/>
+      <w:r>
+        <w:t>corrutina</w:t>
+      </w:r>
+      <w:proofErr w:type="spellEnd"/>
+      <w:r>
+        <w:t xml:space="preserve"> hace trabajo de CPU de </w:t>
       </w:r>
       <w:r>
         <w:rPr>
@@ -3760,7 +4871,15 @@
         <w:t>más de un milisegundo</w:t>
       </w:r>
       <w:r>
-        <w:t xml:space="preserve"> sin ceder. El único caso del sistema es bcrypt, que sale a un hilo por EA-02, y su concurrencia se acota con un semáforo.</w:t>
+        <w:t xml:space="preserve"> sin ceder. El único caso del sistema es </w:t>
+      </w:r>
+      <w:proofErr w:type="spellStart"/>
+      <w:r>
+        <w:t>bcrypt</w:t>
+      </w:r>
+      <w:proofErr w:type="spellEnd"/>
+      <w:r>
+        <w:t>, que sale a un hilo por EA-02, y su concurrencia se acota con un semáforo.</w:t>
       </w:r>
     </w:p>
     <w:p>
@@ -3839,7 +4958,35 @@
                 <w:rFonts w:cs="Calibri"/>
               </w:rPr>
               <w:lastRenderedPageBreak/>
-              <w:t>El umbral de un milisegundo suena exagerado hasta que hacés la cuenta, así que hacela:</w:t>
+              <w:t xml:space="preserve">El umbral de un milisegundo suena exagerado hasta que </w:t>
+            </w:r>
+            <w:proofErr w:type="spellStart"/>
+            <w:r>
+              <w:rPr>
+                <w:rFonts w:cs="Calibri"/>
+              </w:rPr>
+              <w:t>hacés</w:t>
+            </w:r>
+            <w:proofErr w:type="spellEnd"/>
+            <w:r>
+              <w:rPr>
+                <w:rFonts w:cs="Calibri"/>
+              </w:rPr>
+              <w:t xml:space="preserve"> la cuenta, así que </w:t>
+            </w:r>
+            <w:proofErr w:type="spellStart"/>
+            <w:r>
+              <w:rPr>
+                <w:rFonts w:cs="Calibri"/>
+              </w:rPr>
+              <w:t>hacela</w:t>
+            </w:r>
+            <w:proofErr w:type="spellEnd"/>
+            <w:r>
+              <w:rPr>
+                <w:rFonts w:cs="Calibri"/>
+              </w:rPr>
+              <w:t>:</w:t>
             </w:r>
           </w:p>
           <w:p>
@@ -3923,11 +5070,19 @@
                 <w:rFonts w:ascii="Calibri" w:hAnsi="Calibri" w:cs="Calibri"/>
               </w:rPr>
             </w:pPr>
+            <w:proofErr w:type="spellStart"/>
             <w:r>
               <w:rPr>
                 <w:rFonts w:ascii="Calibri" w:hAnsi="Calibri" w:cs="Calibri"/>
               </w:rPr>
-              <w:t xml:space="preserve">bcrypt con factor 12 tarda del orden de </w:t>
+              <w:t>bcrypt</w:t>
+            </w:r>
+            <w:proofErr w:type="spellEnd"/>
+            <w:r>
+              <w:rPr>
+                <w:rFonts w:ascii="Calibri" w:hAnsi="Calibri" w:cs="Calibri"/>
+              </w:rPr>
+              <w:t xml:space="preserve"> con factor 12 tarda del orden de </w:t>
             </w:r>
             <w:r>
               <w:rPr>
@@ -3940,7 +5095,21 @@
               <w:rPr>
                 <w:rFonts w:ascii="Calibri" w:hAnsi="Calibri" w:cs="Calibri"/>
               </w:rPr>
-              <w:t>. Cuatro logins por segundo saturan el proceso completo.</w:t>
+              <w:t xml:space="preserve">. Cuatro </w:t>
+            </w:r>
+            <w:proofErr w:type="spellStart"/>
+            <w:r>
+              <w:rPr>
+                <w:rFonts w:ascii="Calibri" w:hAnsi="Calibri" w:cs="Calibri"/>
+              </w:rPr>
+              <w:t>logins</w:t>
+            </w:r>
+            <w:proofErr w:type="spellEnd"/>
+            <w:r>
+              <w:rPr>
+                <w:rFonts w:ascii="Calibri" w:hAnsi="Calibri" w:cs="Calibri"/>
+              </w:rPr>
+              <w:t xml:space="preserve"> por segundo saturan el proceso completo.</w:t>
             </w:r>
           </w:p>
           <w:p>
@@ -3956,14 +5125,44 @@
               <w:rPr>
                 <w:rFonts w:cs="Calibri"/>
               </w:rPr>
-              <w:t xml:space="preserve">Ese último número es el que explica por qué bcrypt tiene dos reglas dedicadas y un semáforo. </w:t>
+              <w:t xml:space="preserve">Ese último número es el que explica por qué </w:t>
+            </w:r>
+            <w:proofErr w:type="spellStart"/>
+            <w:r>
+              <w:rPr>
+                <w:rFonts w:cs="Calibri"/>
+              </w:rPr>
+              <w:t>bcrypt</w:t>
+            </w:r>
+            <w:proofErr w:type="spellEnd"/>
+            <w:r>
+              <w:rPr>
+                <w:rFonts w:cs="Calibri"/>
+              </w:rPr>
+              <w:t xml:space="preserve"> tiene dos reglas dedicadas y un semáforo. </w:t>
             </w:r>
             <w:r>
               <w:rPr>
                 <w:rFonts w:cs="Calibri"/>
                 <w:b/>
               </w:rPr>
-              <w:t>No es que bcrypt sea lento por estar mal hecho: es lento a propósito</w:t>
+              <w:t xml:space="preserve">No es que </w:t>
+            </w:r>
+            <w:proofErr w:type="spellStart"/>
+            <w:r>
+              <w:rPr>
+                <w:rFonts w:cs="Calibri"/>
+                <w:b/>
+              </w:rPr>
+              <w:t>bcrypt</w:t>
+            </w:r>
+            <w:proofErr w:type="spellEnd"/>
+            <w:r>
+              <w:rPr>
+                <w:rFonts w:cs="Calibri"/>
+                <w:b/>
+              </w:rPr>
+              <w:t xml:space="preserve"> sea lento por estar mal hecho: es lento a propósito</w:t>
             </w:r>
             <w:r>
               <w:rPr>
@@ -4008,7 +5207,23 @@
                 <w:rFonts w:cs="Calibri"/>
                 <w:b/>
               </w:rPr>
-              <w:t>en tu máquina, probando solo, cuatro logins por segundo no van a pasar nunca.</w:t>
+              <w:t xml:space="preserve">en tu máquina, probando solo, cuatro </w:t>
+            </w:r>
+            <w:proofErr w:type="spellStart"/>
+            <w:r>
+              <w:rPr>
+                <w:rFonts w:cs="Calibri"/>
+                <w:b/>
+              </w:rPr>
+              <w:t>logins</w:t>
+            </w:r>
+            <w:proofErr w:type="spellEnd"/>
+            <w:r>
+              <w:rPr>
+                <w:rFonts w:cs="Calibri"/>
+                <w:b/>
+              </w:rPr>
+              <w:t xml:space="preserve"> por segundo no van a pasar nunca.</w:t>
             </w:r>
             <w:r>
               <w:rPr>
@@ -4034,7 +5249,15 @@
       </w:pPr>
       <w:r>
         <w:lastRenderedPageBreak/>
-        <w:t xml:space="preserve">Y falta explicar el semáforo, porque es la parte que sorprende. Sacar bcrypt a un hilo evita bloquear el bucle, pero </w:t>
+        <w:t xml:space="preserve">Y falta explicar el semáforo, porque es la parte que sorprende. Sacar </w:t>
+      </w:r>
+      <w:proofErr w:type="spellStart"/>
+      <w:r>
+        <w:t>bcrypt</w:t>
+      </w:r>
+      <w:proofErr w:type="spellEnd"/>
+      <w:r>
+        <w:t xml:space="preserve"> a un hilo evita bloquear el bucle, pero </w:t>
       </w:r>
       <w:r>
         <w:rPr>
@@ -4069,23 +5292,57 @@
         <w:t>EA-01.</w:t>
       </w:r>
       <w:r>
-        <w:t xml:space="preserve"> Todos los handlers se declaran con </w:t>
-      </w:r>
+        <w:t xml:space="preserve"> Todos los </w:t>
+      </w:r>
+      <w:proofErr w:type="spellStart"/>
+      <w:r>
+        <w:t>handlers</w:t>
+      </w:r>
+      <w:proofErr w:type="spellEnd"/>
+      <w:r>
+        <w:t xml:space="preserve"> se declaran con </w:t>
+      </w:r>
+      <w:proofErr w:type="spellStart"/>
       <w:r>
         <w:rPr>
           <w:rStyle w:val="Cdigoenlnea"/>
         </w:rPr>
-        <w:t>async def</w:t>
-      </w:r>
-      <w:r>
-        <w:t xml:space="preserve">; no hay ningún handler con </w:t>
-      </w:r>
+        <w:t>async</w:t>
+      </w:r>
+      <w:proofErr w:type="spellEnd"/>
+      <w:r>
+        <w:rPr>
+          <w:rStyle w:val="Cdigoenlnea"/>
+        </w:rPr>
+        <w:t xml:space="preserve"> </w:t>
+      </w:r>
+      <w:proofErr w:type="spellStart"/>
       <w:r>
         <w:rPr>
           <w:rStyle w:val="Cdigoenlnea"/>
         </w:rPr>
         <w:t>def</w:t>
       </w:r>
+      <w:proofErr w:type="spellEnd"/>
+      <w:r>
+        <w:t xml:space="preserve">; no hay ningún </w:t>
+      </w:r>
+      <w:proofErr w:type="spellStart"/>
+      <w:r>
+        <w:t>handler</w:t>
+      </w:r>
+      <w:proofErr w:type="spellEnd"/>
+      <w:r>
+        <w:t xml:space="preserve"> con </w:t>
+      </w:r>
+      <w:proofErr w:type="spellStart"/>
+      <w:r>
+        <w:rPr>
+          <w:rStyle w:val="Cdigoenlnea"/>
+        </w:rPr>
+        <w:t>def</w:t>
+      </w:r>
+      <w:proofErr w:type="spellEnd"/>
       <w:r>
         <w:t xml:space="preserve">. </w:t>
       </w:r>
@@ -4093,7 +5350,21 @@
         <w:rPr>
           <w:b/>
         </w:rPr>
-        <w:t>La mezcla —un handler asincrónico que adentro llama a una función bloqueante— es peor que la sincronía completa</w:t>
+        <w:t xml:space="preserve">La mezcla —un </w:t>
+      </w:r>
+      <w:proofErr w:type="spellStart"/>
+      <w:r>
+        <w:rPr>
+          <w:b/>
+        </w:rPr>
+        <w:t>handler</w:t>
+      </w:r>
+      <w:proofErr w:type="spellEnd"/>
+      <w:r>
+        <w:rPr>
+          <w:b/>
+        </w:rPr>
+        <w:t xml:space="preserve"> asincrónico que adentro llama a una función bloqueante— es peor que la sincronía completa</w:t>
       </w:r>
       <w:r>
         <w:t xml:space="preserve">, porque bloquea el bucle de eventos y </w:t>
@@ -4119,14 +5390,24 @@
         <w:t>admite</w:t>
       </w:r>
       <w:r>
-        <w:t xml:space="preserve"> handlers sincrónicos: si se declara uno con </w:t>
-      </w:r>
+        <w:t xml:space="preserve"> </w:t>
+      </w:r>
+      <w:proofErr w:type="spellStart"/>
+      <w:r>
+        <w:t>handlers</w:t>
+      </w:r>
+      <w:proofErr w:type="spellEnd"/>
+      <w:r>
+        <w:t xml:space="preserve"> sincrónicos: si se declara uno con </w:t>
+      </w:r>
+      <w:proofErr w:type="spellStart"/>
       <w:r>
         <w:rPr>
           <w:rStyle w:val="Cdigoenlnea"/>
         </w:rPr>
         <w:t>def</w:t>
       </w:r>
+      <w:proofErr w:type="spellEnd"/>
       <w:r>
         <w:t>, lo ejecuta en un hilo de un grupo reservado. Eso es lento pero contenido: bloquea un hilo de veinte, y el resto sigue.</w:t>
       </w:r>
@@ -4280,14 +5561,24 @@
         </w:drawing>
       </w:r>
       <w:r>
-        <w:t xml:space="preserve">Un handler </w:t>
-      </w:r>
+        <w:t xml:space="preserve">Un </w:t>
+      </w:r>
+      <w:proofErr w:type="spellStart"/>
+      <w:r>
+        <w:t>handler</w:t>
+      </w:r>
+      <w:proofErr w:type="spellEnd"/>
+      <w:r>
+        <w:t xml:space="preserve"> </w:t>
+      </w:r>
+      <w:proofErr w:type="spellStart"/>
       <w:r>
         <w:rPr>
           <w:rStyle w:val="Cdigoenlnea"/>
         </w:rPr>
         <w:t>async</w:t>
       </w:r>
+      <w:proofErr w:type="spellEnd"/>
       <w:r>
         <w:t xml:space="preserve"> con una línea bloqueante adentro </w:t>
       </w:r>
@@ -4375,8 +5666,13 @@
               <w:spacing w:after="100"/>
               <w:jc w:val="left"/>
             </w:pPr>
+            <w:proofErr w:type="spellStart"/>
             <w:r>
-              <w:t>Grabate esta comparación, porque es la que explica por qué EA-01 dice lo que dice:</w:t>
+              <w:t>Grabate</w:t>
+            </w:r>
+            <w:proofErr w:type="spellEnd"/>
+            <w:r>
+              <w:t xml:space="preserve"> esta comparación, porque es la que explica por qué EA-01 dice lo que dice:</w:t>
             </w:r>
           </w:p>
           <w:tbl>
@@ -4476,12 +5772,14 @@
                     </w:rPr>
                     <w:t xml:space="preserve">Handler </w:t>
                   </w:r>
+                  <w:proofErr w:type="spellStart"/>
                   <w:r>
                     <w:rPr>
                       <w:rStyle w:val="Cdigoenlnea"/>
                     </w:rPr>
                     <w:t>def</w:t>
                   </w:r>
+                  <w:proofErr w:type="spellEnd"/>
                   <w:r>
                     <w:rPr>
                       <w:rFonts w:cs="Calibri"/>
@@ -4545,12 +5843,28 @@
                     </w:rPr>
                     <w:t xml:space="preserve">Handler </w:t>
                   </w:r>
+                  <w:proofErr w:type="spellStart"/>
                   <w:r>
                     <w:rPr>
                       <w:rStyle w:val="Cdigoenlnea"/>
                     </w:rPr>
-                    <w:t>async def</w:t>
+                    <w:t>async</w:t>
                   </w:r>
+                  <w:proofErr w:type="spellEnd"/>
+                  <w:r>
+                    <w:rPr>
+                      <w:rStyle w:val="Cdigoenlnea"/>
+                    </w:rPr>
+                    <w:t xml:space="preserve"> </w:t>
+                  </w:r>
+                  <w:proofErr w:type="spellStart"/>
+                  <w:r>
+                    <w:rPr>
+                      <w:rStyle w:val="Cdigoenlnea"/>
+                    </w:rPr>
+                    <w:t>def</w:t>
+                  </w:r>
+                  <w:proofErr w:type="spellEnd"/>
                   <w:r>
                     <w:rPr>
                       <w:rFonts w:cs="Calibri"/>
@@ -4607,12 +5921,28 @@
                     </w:rPr>
                     <w:t xml:space="preserve">Handler </w:t>
                   </w:r>
+                  <w:proofErr w:type="spellStart"/>
                   <w:r>
                     <w:rPr>
                       <w:rStyle w:val="Cdigoenlnea"/>
                     </w:rPr>
-                    <w:t>async def</w:t>
+                    <w:t>async</w:t>
                   </w:r>
+                  <w:proofErr w:type="spellEnd"/>
+                  <w:r>
+                    <w:rPr>
+                      <w:rStyle w:val="Cdigoenlnea"/>
+                    </w:rPr>
+                    <w:t xml:space="preserve"> </w:t>
+                  </w:r>
+                  <w:proofErr w:type="spellStart"/>
+                  <w:r>
+                    <w:rPr>
+                      <w:rStyle w:val="Cdigoenlnea"/>
+                    </w:rPr>
+                    <w:t>def</w:t>
+                  </w:r>
+                  <w:proofErr w:type="spellEnd"/>
                   <w:r>
                     <w:rPr>
                       <w:rFonts w:cs="Calibri"/>
@@ -4699,7 +6029,15 @@
               <w:t>el servidor no responde</w:t>
             </w:r>
             <w:r>
-              <w:t>, incluidos los endpoints que no tienen nada que ver.</w:t>
+              <w:t xml:space="preserve">, incluidos los </w:t>
+            </w:r>
+            <w:proofErr w:type="spellStart"/>
+            <w:r>
+              <w:t>endpoints</w:t>
+            </w:r>
+            <w:proofErr w:type="spellEnd"/>
+            <w:r>
+              <w:t xml:space="preserve"> que no tienen nada que ver.</w:t>
             </w:r>
           </w:p>
           <w:p>
@@ -4765,15 +6103,25 @@
       <w:r>
         <w:t xml:space="preserve"> Toda la I/O usa clientes asincrónicos: </w:t>
       </w:r>
+      <w:proofErr w:type="spellStart"/>
       <w:r>
         <w:rPr>
           <w:b/>
         </w:rPr>
-        <w:t>psycopg asincrónico</w:t>
+        <w:t>psycopg</w:t>
+      </w:r>
+      <w:proofErr w:type="spellEnd"/>
+      <w:r>
+        <w:rPr>
+          <w:b/>
+        </w:rPr>
+        <w:t xml:space="preserve"> asincrónico</w:t>
       </w:r>
       <w:r>
         <w:t xml:space="preserve"> para PostgreSQL, </w:t>
       </w:r>
+      <w:proofErr w:type="spellStart"/>
+      <w:proofErr w:type="gramStart"/>
       <w:r>
         <w:rPr>
           <w:rStyle w:val="Cdigoenlnea"/>
@@ -4781,9 +6129,13 @@
         </w:rPr>
         <w:t>redis.asyncio</w:t>
       </w:r>
+      <w:proofErr w:type="spellEnd"/>
+      <w:proofErr w:type="gramEnd"/>
       <w:r>
         <w:t xml:space="preserve"> para Redis, </w:t>
       </w:r>
+      <w:proofErr w:type="spellStart"/>
+      <w:proofErr w:type="gramStart"/>
       <w:r>
         <w:rPr>
           <w:rStyle w:val="Cdigoenlnea"/>
@@ -4791,6 +6143,8 @@
         </w:rPr>
         <w:t>httpx.AsyncClient</w:t>
       </w:r>
+      <w:proofErr w:type="spellEnd"/>
+      <w:proofErr w:type="gramEnd"/>
       <w:r>
         <w:t xml:space="preserve"> para cualquier llamada saliente. </w:t>
       </w:r>
@@ -4800,6 +6154,7 @@
         </w:rPr>
         <w:t xml:space="preserve">No se importa el módulo </w:t>
       </w:r>
+      <w:proofErr w:type="spellStart"/>
       <w:r>
         <w:rPr>
           <w:rStyle w:val="Cdigoenlnea"/>
@@ -4807,11 +6162,26 @@
         </w:rPr>
         <w:t>redis</w:t>
       </w:r>
+      <w:proofErr w:type="spellEnd"/>
       <w:r>
         <w:rPr>
           <w:b/>
         </w:rPr>
-        <w:t xml:space="preserve"> síncrono en ninguna parte del backend.</w:t>
+        <w:t xml:space="preserve"> síncrono en ninguna parte del </w:t>
+      </w:r>
+      <w:proofErr w:type="spellStart"/>
+      <w:r>
+        <w:rPr>
+          <w:b/>
+        </w:rPr>
+        <w:t>backend</w:t>
+      </w:r>
+      <w:proofErr w:type="spellEnd"/>
+      <w:r>
+        <w:rPr>
+          <w:b/>
+        </w:rPr>
+        <w:t>.</w:t>
       </w:r>
     </w:p>
     <w:p>
@@ -4819,14 +6189,30 @@
         <w:pStyle w:val="Cuerpo"/>
       </w:pPr>
       <w:r>
-        <w:t xml:space="preserve">La última frase es la que la vuelve verificable. No dice "usá el cliente asincrónico": dice que </w:t>
+        <w:t>La última frase es la que la vuelve verificable. No dice "</w:t>
+      </w:r>
+      <w:proofErr w:type="spellStart"/>
+      <w:r>
+        <w:t>usá</w:t>
+      </w:r>
+      <w:proofErr w:type="spellEnd"/>
+      <w:r>
+        <w:t xml:space="preserve"> el cliente asincrónico": dice que </w:t>
       </w:r>
       <w:r>
         <w:rPr>
           <w:b/>
         </w:rPr>
-        <w:t>el otro no aparece en ningún import</w:t>
-      </w:r>
+        <w:t xml:space="preserve">el otro no aparece en ningún </w:t>
+      </w:r>
+      <w:proofErr w:type="spellStart"/>
+      <w:r>
+        <w:rPr>
+          <w:b/>
+        </w:rPr>
+        <w:t>import</w:t>
+      </w:r>
+      <w:proofErr w:type="spellEnd"/>
       <w:r>
         <w:t>, y eso se puede comprobar con una búsqueda de texto.</w:t>
       </w:r>
@@ -4948,12 +6334,28 @@
                 <w:rStyle w:val="Cdigoenlnea"/>
               </w:rPr>
             </w:pPr>
+            <w:proofErr w:type="spellStart"/>
             <w:r>
               <w:rPr>
                 <w:rStyle w:val="Cdigoenlnea"/>
               </w:rPr>
-              <w:t>import redis</w:t>
+              <w:t>import</w:t>
             </w:r>
+            <w:proofErr w:type="spellEnd"/>
+            <w:r>
+              <w:rPr>
+                <w:rStyle w:val="Cdigoenlnea"/>
+              </w:rPr>
+              <w:t xml:space="preserve"> </w:t>
+            </w:r>
+            <w:proofErr w:type="spellStart"/>
+            <w:r>
+              <w:rPr>
+                <w:rStyle w:val="Cdigoenlnea"/>
+              </w:rPr>
+              <w:t>redis</w:t>
+            </w:r>
+            <w:proofErr w:type="spellEnd"/>
           </w:p>
         </w:tc>
         <w:tc>
@@ -4967,12 +6369,44 @@
                 <w:rStyle w:val="Cdigoenlnea"/>
               </w:rPr>
             </w:pPr>
+            <w:proofErr w:type="spellStart"/>
             <w:r>
               <w:rPr>
                 <w:rStyle w:val="Cdigoenlnea"/>
               </w:rPr>
-              <w:t>import redis.asyncio as redis</w:t>
+              <w:t>import</w:t>
             </w:r>
+            <w:proofErr w:type="spellEnd"/>
+            <w:r>
+              <w:rPr>
+                <w:rStyle w:val="Cdigoenlnea"/>
+              </w:rPr>
+              <w:t xml:space="preserve"> </w:t>
+            </w:r>
+            <w:proofErr w:type="spellStart"/>
+            <w:proofErr w:type="gramStart"/>
+            <w:r>
+              <w:rPr>
+                <w:rStyle w:val="Cdigoenlnea"/>
+              </w:rPr>
+              <w:t>redis.asyncio</w:t>
+            </w:r>
+            <w:proofErr w:type="spellEnd"/>
+            <w:proofErr w:type="gramEnd"/>
+            <w:r>
+              <w:rPr>
+                <w:rStyle w:val="Cdigoenlnea"/>
+              </w:rPr>
+              <w:t xml:space="preserve"> as </w:t>
+            </w:r>
+            <w:proofErr w:type="spellStart"/>
+            <w:r>
+              <w:rPr>
+                <w:rStyle w:val="Cdigoenlnea"/>
+              </w:rPr>
+              <w:t>redis</w:t>
+            </w:r>
+            <w:proofErr w:type="spellEnd"/>
           </w:p>
         </w:tc>
       </w:tr>
@@ -4988,11 +6422,109 @@
                 <w:rStyle w:val="Cdigoenlnea"/>
               </w:rPr>
             </w:pPr>
+            <w:proofErr w:type="spellStart"/>
             <w:r>
               <w:rPr>
                 <w:rStyle w:val="Cdigoenlnea"/>
               </w:rPr>
-              <w:t>import requests</w:t>
+              <w:t>import</w:t>
+            </w:r>
+            <w:proofErr w:type="spellEnd"/>
+            <w:r>
+              <w:rPr>
+                <w:rStyle w:val="Cdigoenlnea"/>
+              </w:rPr>
+              <w:t xml:space="preserve"> </w:t>
+            </w:r>
+            <w:proofErr w:type="spellStart"/>
+            <w:r>
+              <w:rPr>
+                <w:rStyle w:val="Cdigoenlnea"/>
+              </w:rPr>
+              <w:t>requests</w:t>
+            </w:r>
+            <w:proofErr w:type="spellEnd"/>
+          </w:p>
+        </w:tc>
+        <w:tc>
+          <w:tcPr>
+            <w:tcW w:w="4247" w:type="dxa"/>
+          </w:tcPr>
+          <w:p>
+            <w:pPr>
+              <w:pStyle w:val="Cuerpo"/>
+              <w:rPr>
+                <w:rFonts w:cs="Calibri"/>
+                <w:sz w:val="20"/>
+              </w:rPr>
+            </w:pPr>
+            <w:proofErr w:type="spellStart"/>
+            <w:r>
+              <w:rPr>
+                <w:rStyle w:val="Cdigoenlnea"/>
+              </w:rPr>
+              <w:t>import</w:t>
+            </w:r>
+            <w:proofErr w:type="spellEnd"/>
+            <w:r>
+              <w:rPr>
+                <w:rStyle w:val="Cdigoenlnea"/>
+              </w:rPr>
+              <w:t xml:space="preserve"> </w:t>
+            </w:r>
+            <w:proofErr w:type="spellStart"/>
+            <w:r>
+              <w:rPr>
+                <w:rStyle w:val="Cdigoenlnea"/>
+              </w:rPr>
+              <w:t>httpx</w:t>
+            </w:r>
+            <w:proofErr w:type="spellEnd"/>
+            <w:r>
+              <w:rPr>
+                <w:rFonts w:cs="Calibri"/>
+                <w:sz w:val="20"/>
+              </w:rPr>
+              <w:t xml:space="preserve"> con </w:t>
+            </w:r>
+            <w:proofErr w:type="spellStart"/>
+            <w:r>
+              <w:rPr>
+                <w:rStyle w:val="Cdigoenlnea"/>
+              </w:rPr>
+              <w:t>AsyncClient</w:t>
+            </w:r>
+            <w:proofErr w:type="spellEnd"/>
+          </w:p>
+        </w:tc>
+      </w:tr>
+      <w:tr>
+        <w:tc>
+          <w:tcPr>
+            <w:tcW w:w="4247" w:type="dxa"/>
+          </w:tcPr>
+          <w:p>
+            <w:pPr>
+              <w:pStyle w:val="Cuerpo"/>
+              <w:rPr>
+                <w:rStyle w:val="Cdigoenlnea"/>
+              </w:rPr>
+            </w:pPr>
+            <w:proofErr w:type="spellStart"/>
+            <w:proofErr w:type="gramStart"/>
+            <w:r>
+              <w:rPr>
+                <w:rStyle w:val="Cdigoenlnea"/>
+              </w:rPr>
+              <w:t>psycopg.connect</w:t>
+            </w:r>
+            <w:proofErr w:type="spellEnd"/>
+            <w:proofErr w:type="gramEnd"/>
+            <w:r>
+              <w:rPr>
+                <w:rStyle w:val="Cdigoenlnea"/>
+              </w:rPr>
+              <w:t>(...)</w:t>
             </w:r>
           </w:p>
         </w:tc>
@@ -5008,25 +6540,29 @@
                 <w:sz w:val="20"/>
               </w:rPr>
             </w:pPr>
+            <w:proofErr w:type="spellStart"/>
             <w:r>
               <w:rPr>
                 <w:rStyle w:val="Cdigoenlnea"/>
               </w:rPr>
-              <w:t>import httpx</w:t>
+              <w:t>psycopg</w:t>
             </w:r>
+            <w:proofErr w:type="spellEnd"/>
             <w:r>
               <w:rPr>
                 <w:rFonts w:cs="Calibri"/>
                 <w:sz w:val="20"/>
               </w:rPr>
-              <w:t xml:space="preserve"> con </w:t>
+              <w:t xml:space="preserve"> asincrónico vía </w:t>
             </w:r>
+            <w:proofErr w:type="spellStart"/>
             <w:r>
               <w:rPr>
                 <w:rStyle w:val="Cdigoenlnea"/>
               </w:rPr>
-              <w:t>AsyncClient</w:t>
+              <w:t>create_async_engine</w:t>
             </w:r>
+            <w:proofErr w:type="spellEnd"/>
           </w:p>
         </w:tc>
       </w:tr>
@@ -5042,65 +6578,21 @@
                 <w:rStyle w:val="Cdigoenlnea"/>
               </w:rPr>
             </w:pPr>
+            <w:proofErr w:type="spellStart"/>
+            <w:proofErr w:type="gramStart"/>
             <w:r>
               <w:rPr>
                 <w:rStyle w:val="Cdigoenlnea"/>
               </w:rPr>
-              <w:t>psycopg.connect(...)</w:t>
+              <w:t>time.sleep</w:t>
             </w:r>
-          </w:p>
-        </w:tc>
-        <w:tc>
-          <w:tcPr>
-            <w:tcW w:w="4247" w:type="dxa"/>
-          </w:tcPr>
-          <w:p>
-            <w:pPr>
-              <w:pStyle w:val="Cuerpo"/>
-              <w:rPr>
-                <w:rFonts w:cs="Calibri"/>
-                <w:sz w:val="20"/>
-              </w:rPr>
-            </w:pPr>
+            <w:proofErr w:type="spellEnd"/>
+            <w:proofErr w:type="gramEnd"/>
             <w:r>
               <w:rPr>
                 <w:rStyle w:val="Cdigoenlnea"/>
               </w:rPr>
-              <w:t>psycopg</w:t>
-            </w:r>
-            <w:r>
-              <w:rPr>
-                <w:rFonts w:cs="Calibri"/>
-                <w:sz w:val="20"/>
-              </w:rPr>
-              <w:t xml:space="preserve"> asincrónico vía </w:t>
-            </w:r>
-            <w:r>
-              <w:rPr>
-                <w:rStyle w:val="Cdigoenlnea"/>
-              </w:rPr>
-              <w:t>create_async_engine</w:t>
-            </w:r>
-          </w:p>
-        </w:tc>
-      </w:tr>
-      <w:tr>
-        <w:tc>
-          <w:tcPr>
-            <w:tcW w:w="4247" w:type="dxa"/>
-          </w:tcPr>
-          <w:p>
-            <w:pPr>
-              <w:pStyle w:val="Cuerpo"/>
-              <w:rPr>
-                <w:rStyle w:val="Cdigoenlnea"/>
-              </w:rPr>
-            </w:pPr>
-            <w:r>
-              <w:rPr>
-                <w:rStyle w:val="Cdigoenlnea"/>
-              </w:rPr>
-              <w:t>time.sleep(n)</w:t>
+              <w:t>(n)</w:t>
             </w:r>
           </w:p>
         </w:tc>
@@ -5115,11 +6607,35 @@
                 <w:rStyle w:val="Cdigoenlnea"/>
               </w:rPr>
             </w:pPr>
+            <w:proofErr w:type="spellStart"/>
             <w:r>
               <w:rPr>
                 <w:rStyle w:val="Cdigoenlnea"/>
               </w:rPr>
-              <w:t>await asyncio.sleep(n)</w:t>
+              <w:t>await</w:t>
+            </w:r>
+            <w:proofErr w:type="spellEnd"/>
+            <w:r>
+              <w:rPr>
+                <w:rStyle w:val="Cdigoenlnea"/>
+              </w:rPr>
+              <w:t xml:space="preserve"> </w:t>
+            </w:r>
+            <w:proofErr w:type="spellStart"/>
+            <w:proofErr w:type="gramStart"/>
+            <w:r>
+              <w:rPr>
+                <w:rStyle w:val="Cdigoenlnea"/>
+              </w:rPr>
+              <w:t>asyncio.sleep</w:t>
+            </w:r>
+            <w:proofErr w:type="spellEnd"/>
+            <w:proofErr w:type="gramEnd"/>
+            <w:r>
+              <w:rPr>
+                <w:rStyle w:val="Cdigoenlnea"/>
+              </w:rPr>
+              <w:t>(n)</w:t>
             </w:r>
           </w:p>
         </w:tc>
@@ -5132,12 +6648,16 @@
       <w:r>
         <w:t xml:space="preserve">La última fila merece mención porque aparece en código de prueba todo el tiempo: </w:t>
       </w:r>
+      <w:proofErr w:type="spellStart"/>
+      <w:proofErr w:type="gramStart"/>
       <w:r>
         <w:rPr>
           <w:rStyle w:val="Cdigoenlnea"/>
         </w:rPr>
         <w:t>time.sleep</w:t>
       </w:r>
+      <w:proofErr w:type="spellEnd"/>
+      <w:proofErr w:type="gramEnd"/>
       <w:r>
         <w:t xml:space="preserve"> </w:t>
       </w:r>
@@ -5228,14 +6748,44 @@
               <w:jc w:val="left"/>
             </w:pPr>
             <w:r>
-              <w:t xml:space="preserve">El TPI no dice "usá el cliente asincrónico". Dice que el sincrónico </w:t>
+              <w:t>El TPI no dice "</w:t>
+            </w:r>
+            <w:proofErr w:type="spellStart"/>
+            <w:r>
+              <w:t>usá</w:t>
+            </w:r>
+            <w:proofErr w:type="spellEnd"/>
+            <w:r>
+              <w:t xml:space="preserve"> el cliente asincrónico". Dice que el sincrónico </w:t>
             </w:r>
             <w:r>
               <w:rPr>
                 <w:b/>
               </w:rPr>
-              <w:t>no aparece en ningún import del backend</w:t>
+              <w:t xml:space="preserve">no aparece en ningún </w:t>
             </w:r>
+            <w:proofErr w:type="spellStart"/>
+            <w:r>
+              <w:rPr>
+                <w:b/>
+              </w:rPr>
+              <w:t>import</w:t>
+            </w:r>
+            <w:proofErr w:type="spellEnd"/>
+            <w:r>
+              <w:rPr>
+                <w:b/>
+              </w:rPr>
+              <w:t xml:space="preserve"> del </w:t>
+            </w:r>
+            <w:proofErr w:type="spellStart"/>
+            <w:r>
+              <w:rPr>
+                <w:b/>
+              </w:rPr>
+              <w:t>backend</w:t>
+            </w:r>
+            <w:proofErr w:type="spellEnd"/>
             <w:r>
               <w:t>. Eso es comprobable:</w:t>
             </w:r>
@@ -5245,7 +6795,65 @@
               <w:pStyle w:val="Bloquedecdigo"/>
             </w:pPr>
             <w:r>
-              <w:t>grep -rn "^import requests\|^import redis$\|time.sleep" app/</w:t>
+              <w:t>grep -</w:t>
+            </w:r>
+            <w:proofErr w:type="spellStart"/>
+            <w:r>
+              <w:t>rn</w:t>
+            </w:r>
+            <w:proofErr w:type="spellEnd"/>
+            <w:r>
+              <w:t xml:space="preserve"> "^</w:t>
+            </w:r>
+            <w:proofErr w:type="spellStart"/>
+            <w:r>
+              <w:t>import</w:t>
+            </w:r>
+            <w:proofErr w:type="spellEnd"/>
+            <w:r>
+              <w:t xml:space="preserve"> </w:t>
+            </w:r>
+            <w:proofErr w:type="spellStart"/>
+            <w:r>
+              <w:t>requests</w:t>
+            </w:r>
+            <w:proofErr w:type="spellEnd"/>
+            <w:r>
+              <w:t>\|^</w:t>
+            </w:r>
+            <w:proofErr w:type="spellStart"/>
+            <w:r>
+              <w:t>import</w:t>
+            </w:r>
+            <w:proofErr w:type="spellEnd"/>
+            <w:r>
+              <w:t xml:space="preserve"> </w:t>
+            </w:r>
+            <w:proofErr w:type="spellStart"/>
+            <w:r>
+              <w:t>redis</w:t>
+            </w:r>
+            <w:proofErr w:type="spellEnd"/>
+            <w:r>
+              <w:t>$\|</w:t>
+            </w:r>
+            <w:proofErr w:type="spellStart"/>
+            <w:proofErr w:type="gramStart"/>
+            <w:r>
+              <w:t>time.sleep</w:t>
+            </w:r>
+            <w:proofErr w:type="spellEnd"/>
+            <w:proofErr w:type="gramEnd"/>
+            <w:r>
+              <w:t xml:space="preserve">" </w:t>
+            </w:r>
+            <w:proofErr w:type="gramStart"/>
+            <w:r>
+              <w:t>app</w:t>
+            </w:r>
+            <w:proofErr w:type="gramEnd"/>
+            <w:r>
+              <w:t>/</w:t>
             </w:r>
           </w:p>
           <w:p>
@@ -5264,9 +6872,14 @@
               <w:spacing w:after="100"/>
               <w:jc w:val="left"/>
             </w:pPr>
+            <w:proofErr w:type="spellStart"/>
             <w:r>
               <w:lastRenderedPageBreak/>
-              <w:t xml:space="preserve">Fijate por qué eso importa: </w:t>
+              <w:t>Fijate</w:t>
+            </w:r>
+            <w:proofErr w:type="spellEnd"/>
+            <w:r>
+              <w:t xml:space="preserve"> por qué eso importa: </w:t>
             </w:r>
             <w:r>
               <w:rPr>
@@ -5294,7 +6907,23 @@
               <w:t>grep</w:t>
             </w:r>
             <w:r>
-              <w:t xml:space="preserve"> va en el mismo lugar donde corren los tests. Y lo mismo vale para el resto: cada vez que puedas convertir una regla en una verificación automática, hacelo.</w:t>
+              <w:t xml:space="preserve"> va en el mismo lugar donde corren los </w:t>
+            </w:r>
+            <w:proofErr w:type="spellStart"/>
+            <w:r>
+              <w:t>tests</w:t>
+            </w:r>
+            <w:proofErr w:type="spellEnd"/>
+            <w:r>
+              <w:t xml:space="preserve">. Y lo mismo vale para el resto: cada vez que puedas convertir una regla en una verificación automática, </w:t>
+            </w:r>
+            <w:proofErr w:type="spellStart"/>
+            <w:r>
+              <w:t>hacelo</w:t>
+            </w:r>
+            <w:proofErr w:type="spellEnd"/>
+            <w:r>
+              <w:t>.</w:t>
             </w:r>
           </w:p>
           <w:p>
@@ -5330,9 +6959,17 @@
         <w:rPr>
           <w:b w:val="0"/>
         </w:rPr>
-        <w:t>3.8. La regla del greenlet</w:t>
+        <w:t xml:space="preserve">3.8. La regla del </w:t>
+      </w:r>
+      <w:proofErr w:type="spellStart"/>
+      <w:r>
+        <w:rPr>
+          <w:b w:val="0"/>
+        </w:rPr>
+        <w:t>greenlet</w:t>
       </w:r>
       <w:bookmarkEnd w:id="9"/>
+      <w:proofErr w:type="spellEnd"/>
     </w:p>
     <w:p>
       <w:pPr>
@@ -5380,15 +7017,28 @@
         <w:pStyle w:val="Cuerpo"/>
         <w:ind w:left="360" w:right="360"/>
       </w:pPr>
-      <w:r>
-        <w:t xml:space="preserve">SQLAlchemy implementa su capa asincrónica </w:t>
+      <w:proofErr w:type="spellStart"/>
+      <w:r>
+        <w:t>SQLAlchemy</w:t>
+      </w:r>
+      <w:proofErr w:type="spellEnd"/>
+      <w:r>
+        <w:t xml:space="preserve"> implementa su capa asincrónica </w:t>
       </w:r>
       <w:r>
         <w:rPr>
           <w:b/>
         </w:rPr>
-        <w:t>ejecutando el ORM síncrono dentro de un greenlet</w:t>
-      </w:r>
+        <w:t xml:space="preserve">ejecutando el ORM síncrono dentro de un </w:t>
+      </w:r>
+      <w:proofErr w:type="spellStart"/>
+      <w:r>
+        <w:rPr>
+          <w:b/>
+        </w:rPr>
+        <w:t>greenlet</w:t>
+      </w:r>
+      <w:proofErr w:type="spellEnd"/>
       <w:r>
         <w:t xml:space="preserve"> y saltando al bucle de eventos cada vez que necesita I/O.</w:t>
       </w:r>
@@ -5400,21 +7050,47 @@
       <w:r>
         <w:t xml:space="preserve">Un </w:t>
       </w:r>
+      <w:proofErr w:type="spellStart"/>
       <w:r>
         <w:rPr>
           <w:i/>
         </w:rPr>
         <w:t>greenlet</w:t>
       </w:r>
-      <w:r>
-        <w:t xml:space="preserve"> es una corrutina de bajo nivel: una unidad de ejecución que puede suspenderse y reanudarse, implementada por fuera del lenguaje. Lo que SQLAlchemy hace es no reescribir su ORM —que tiene años de trabajo y es sincrónico— sino </w:t>
+      <w:proofErr w:type="spellEnd"/>
+      <w:r>
+        <w:t xml:space="preserve"> es una </w:t>
+      </w:r>
+      <w:proofErr w:type="spellStart"/>
+      <w:r>
+        <w:t>corrutina</w:t>
+      </w:r>
+      <w:proofErr w:type="spellEnd"/>
+      <w:r>
+        <w:t xml:space="preserve"> de bajo nivel: una unidad de ejecución que puede suspenderse y reanudarse, implementada por fuera del lenguaje. Lo que </w:t>
+      </w:r>
+      <w:proofErr w:type="spellStart"/>
+      <w:r>
+        <w:t>SQLAlchemy</w:t>
+      </w:r>
+      <w:proofErr w:type="spellEnd"/>
+      <w:r>
+        <w:t xml:space="preserve"> hace es no reescribir su ORM —que tiene años de trabajo y es sincrónico— sino </w:t>
       </w:r>
       <w:r>
         <w:rPr>
           <w:b/>
         </w:rPr>
-        <w:t>ejecutarlo adentro de uno de estos greenlets</w:t>
-      </w:r>
+        <w:t xml:space="preserve">ejecutarlo adentro de uno de estos </w:t>
+      </w:r>
+      <w:proofErr w:type="spellStart"/>
+      <w:r>
+        <w:rPr>
+          <w:b/>
+        </w:rPr>
+        <w:t>greenlets</w:t>
+      </w:r>
+      <w:proofErr w:type="spellEnd"/>
       <w:r>
         <w:t>, y cada vez que ese código sincrónico necesita hablar con la base, saltar al bucle de eventos, esperar ahí, y volver.</w:t>
       </w:r>
@@ -5439,17 +7115,33 @@
         <w:rPr>
           <w:b/>
         </w:rPr>
-        <w:t>mientras la I/O ocurra donde SQLAlchemy la espera</w:t>
+        <w:t xml:space="preserve">mientras la I/O ocurra donde </w:t>
+      </w:r>
+      <w:proofErr w:type="spellStart"/>
+      <w:r>
+        <w:rPr>
+          <w:b/>
+        </w:rPr>
+        <w:t>SQLAlchemy</w:t>
+      </w:r>
+      <w:proofErr w:type="spellEnd"/>
+      <w:r>
+        <w:rPr>
+          <w:b/>
+        </w:rPr>
+        <w:t xml:space="preserve"> la espera</w:t>
       </w:r>
       <w:r>
         <w:t xml:space="preserve">: dentro de un </w:t>
       </w:r>
+      <w:proofErr w:type="spellStart"/>
       <w:r>
         <w:rPr>
           <w:rStyle w:val="Cdigoenlnea"/>
         </w:rPr>
         <w:t>await</w:t>
       </w:r>
+      <w:proofErr w:type="spellEnd"/>
       <w:r>
         <w:t xml:space="preserve"> sobre uno de sus métodos.</w:t>
       </w:r>
@@ -5465,17 +7157,35 @@
         <w:rPr>
           <w:b/>
         </w:rPr>
-        <w:t>desde adentro del greenlet</w:t>
-      </w:r>
-      <w:r>
-        <w:t xml:space="preserve">, y sólo se entra al greenlet cuando se hace </w:t>
-      </w:r>
+        <w:t xml:space="preserve">desde adentro del </w:t>
+      </w:r>
+      <w:proofErr w:type="spellStart"/>
+      <w:r>
+        <w:rPr>
+          <w:b/>
+        </w:rPr>
+        <w:t>greenlet</w:t>
+      </w:r>
+      <w:proofErr w:type="spellEnd"/>
+      <w:r>
+        <w:t xml:space="preserve">, y sólo se entra al </w:t>
+      </w:r>
+      <w:proofErr w:type="spellStart"/>
+      <w:r>
+        <w:t>greenlet</w:t>
+      </w:r>
+      <w:proofErr w:type="spellEnd"/>
+      <w:r>
+        <w:t xml:space="preserve"> cuando se hace </w:t>
+      </w:r>
+      <w:proofErr w:type="spellStart"/>
       <w:r>
         <w:rPr>
           <w:rStyle w:val="Cdigoenlnea"/>
         </w:rPr>
         <w:t>await</w:t>
       </w:r>
+      <w:proofErr w:type="spellEnd"/>
       <w:r>
         <w:t xml:space="preserve"> sobre un método del ORM.</w:t>
       </w:r>
@@ -5492,7 +7202,21 @@
         <w:rPr>
           <w:b w:val="0"/>
         </w:rPr>
-        <w:t>3.8.2. Cuándo falla y por qué el mensaje no ayuda</w:t>
+        <w:t xml:space="preserve">3.8.2. </w:t>
+      </w:r>
+      <w:proofErr w:type="gramStart"/>
+      <w:r>
+        <w:rPr>
+          <w:b w:val="0"/>
+        </w:rPr>
+        <w:t>Cuándo</w:t>
+      </w:r>
+      <w:proofErr w:type="gramEnd"/>
+      <w:r>
+        <w:rPr>
+          <w:b w:val="0"/>
+        </w:rPr>
+        <w:t xml:space="preserve"> falla y por qué el mensaje no ayuda</w:t>
       </w:r>
       <w:bookmarkEnd w:id="11"/>
     </w:p>
@@ -5510,6 +7234,7 @@
         </w:rPr>
         <w:t xml:space="preserve">desde un lugar donde no hay </w:t>
       </w:r>
+      <w:proofErr w:type="spellStart"/>
       <w:r>
         <w:rPr>
           <w:rStyle w:val="Cdigoenlnea"/>
@@ -5517,8 +7242,17 @@
         </w:rPr>
         <w:t>await</w:t>
       </w:r>
-      <w:r>
-        <w:t xml:space="preserve"> —al leer un atributo de una relación no cargada, o al tocar un objeto expirado después del commit— </w:t>
+      <w:proofErr w:type="spellEnd"/>
+      <w:r>
+        <w:t xml:space="preserve"> —al leer un atributo de una relación no cargada, o al tocar un objeto expirado después del </w:t>
+      </w:r>
+      <w:proofErr w:type="spellStart"/>
+      <w:r>
+        <w:t>commit</w:t>
+      </w:r>
+      <w:proofErr w:type="spellEnd"/>
+      <w:r>
+        <w:t xml:space="preserve">— </w:t>
       </w:r>
       <w:r>
         <w:rPr>
@@ -5529,12 +7263,14 @@
       <w:r>
         <w:t xml:space="preserve">, y la excepción es </w:t>
       </w:r>
+      <w:proofErr w:type="spellStart"/>
       <w:r>
         <w:rPr>
           <w:rStyle w:val="Cdigoenlnea"/>
         </w:rPr>
         <w:t>MissingGreenlet</w:t>
       </w:r>
+      <w:proofErr w:type="spellEnd"/>
       <w:r>
         <w:t>.</w:t>
       </w:r>
@@ -5560,23 +7296,37 @@
       <w:r>
         <w:t xml:space="preserve"> El objeto está en memoria, se accede a </w:t>
       </w:r>
+      <w:proofErr w:type="spellStart"/>
+      <w:proofErr w:type="gramStart"/>
       <w:r>
         <w:rPr>
           <w:rStyle w:val="Cdigoenlnea"/>
         </w:rPr>
         <w:t>pedido.usuario</w:t>
       </w:r>
+      <w:proofErr w:type="spellEnd"/>
+      <w:proofErr w:type="gramEnd"/>
       <w:r>
         <w:t xml:space="preserve">, y el ORM decide que necesita ir a buscarlo. Pero ese acceso ocurre en una línea común, sin </w:t>
       </w:r>
+      <w:proofErr w:type="spellStart"/>
       <w:r>
         <w:rPr>
           <w:rStyle w:val="Cdigoenlnea"/>
         </w:rPr>
         <w:t>await</w:t>
       </w:r>
-      <w:r>
-        <w:t>. No hay greenlet. Excepción.</w:t>
+      <w:proofErr w:type="spellEnd"/>
+      <w:r>
+        <w:t xml:space="preserve">. No hay </w:t>
+      </w:r>
+      <w:proofErr w:type="spellStart"/>
+      <w:r>
+        <w:t>greenlet</w:t>
+      </w:r>
+      <w:proofErr w:type="spellEnd"/>
+      <w:r>
+        <w:t>. Excepción.</w:t>
       </w:r>
     </w:p>
     <w:p>
@@ -5613,11 +7363,27 @@
       <w:r>
         <w:t xml:space="preserve">. Toda relación que una respuesta vaya a leer se precarga explícitamente con </w:t>
       </w:r>
+      <w:proofErr w:type="spellStart"/>
+      <w:proofErr w:type="gramStart"/>
       <w:r>
         <w:rPr>
           <w:rStyle w:val="Cdigoenlnea"/>
         </w:rPr>
-        <w:t>selectinload()</w:t>
+        <w:t>selectinload</w:t>
+      </w:r>
+      <w:proofErr w:type="spellEnd"/>
+      <w:r>
+        <w:rPr>
+          <w:rStyle w:val="Cdigoenlnea"/>
+        </w:rPr>
+        <w:t>(</w:t>
+      </w:r>
+      <w:proofErr w:type="gramEnd"/>
+      <w:r>
+        <w:rPr>
+          <w:rStyle w:val="Cdigoenlnea"/>
+        </w:rPr>
+        <w:t>)</w:t>
       </w:r>
       <w:r>
         <w:t xml:space="preserve"> en la consulta del repositorio, según la tabla de precarga de la sección 8.3.</w:t>
@@ -5632,7 +7398,21 @@
           <w:b/>
         </w:rPr>
         <w:lastRenderedPageBreak/>
-        <w:t>Segunda causa: tocar un objeto después del commit.</w:t>
+        <w:t xml:space="preserve">Segunda causa: tocar un objeto después del </w:t>
+      </w:r>
+      <w:proofErr w:type="spellStart"/>
+      <w:r>
+        <w:rPr>
+          <w:b/>
+        </w:rPr>
+        <w:t>commit</w:t>
+      </w:r>
+      <w:proofErr w:type="spellEnd"/>
+      <w:r>
+        <w:rPr>
+          <w:b/>
+        </w:rPr>
+        <w:t>.</w:t>
       </w:r>
       <w:r>
         <w:t xml:space="preserve"> Por defecto, al confirmar una transacción el ORM marca sus objetos como expirados, para que la próxima lectura traiga datos frescos. Esa próxima lectura </w:t>
@@ -5672,11 +7452,33 @@
       <w:r>
         <w:t xml:space="preserve">La sesión se construye con </w:t>
       </w:r>
+      <w:proofErr w:type="spellStart"/>
       <w:r>
         <w:rPr>
           <w:rStyle w:val="Cdigoenlnea"/>
         </w:rPr>
-        <w:t>async_sessionmaker(expire_on_commit=False)</w:t>
+        <w:t>async_sessionmaker</w:t>
+      </w:r>
+      <w:proofErr w:type="spellEnd"/>
+      <w:r>
+        <w:rPr>
+          <w:rStyle w:val="Cdigoenlnea"/>
+        </w:rPr>
+        <w:t>(</w:t>
+      </w:r>
+      <w:proofErr w:type="spellStart"/>
+      <w:r>
+        <w:rPr>
+          <w:rStyle w:val="Cdigoenlnea"/>
+        </w:rPr>
+        <w:t>expire_on_commit</w:t>
+      </w:r>
+      <w:proofErr w:type="spellEnd"/>
+      <w:r>
+        <w:rPr>
+          <w:rStyle w:val="Cdigoenlnea"/>
+        </w:rPr>
+        <w:t>=False)</w:t>
       </w:r>
       <w:r>
         <w:t xml:space="preserve">. </w:t>
@@ -5710,14 +7512,24 @@
         <w:t>True</w:t>
       </w:r>
       <w:r>
-        <w:t xml:space="preserve">, el objeto queda expirado tras el commit y su primera lectura posterior intenta emitir I/O implícita, que en modo asincrónico lanza </w:t>
-      </w:r>
+        <w:t xml:space="preserve">, el objeto queda expirado tras el </w:t>
+      </w:r>
+      <w:proofErr w:type="spellStart"/>
+      <w:r>
+        <w:t>commit</w:t>
+      </w:r>
+      <w:proofErr w:type="spellEnd"/>
+      <w:r>
+        <w:t xml:space="preserve"> y su primera lectura posterior intenta emitir I/O implícita, que en modo asincrónico lanza </w:t>
+      </w:r>
+      <w:proofErr w:type="spellStart"/>
       <w:r>
         <w:rPr>
           <w:rStyle w:val="Cdigoenlnea"/>
         </w:rPr>
         <w:t>MissingGreenlet</w:t>
       </w:r>
+      <w:proofErr w:type="spellEnd"/>
       <w:r>
         <w:t>.</w:t>
       </w:r>
@@ -5789,17 +7601,118 @@
           <w:noProof/>
         </w:rPr>
         <w:drawing>
-          <wp:anchor distT="0" distB="0" distL="114300" distR="114300" simplePos="0" relativeHeight="251663360" behindDoc="0" locked="0" layoutInCell="1" allowOverlap="1" wp14:anchorId="18CB57D4" wp14:editId="56A07BE3">
+          <wp:anchor distT="0" distB="0" distL="114300" distR="114300" simplePos="0" relativeHeight="251661312" behindDoc="0" locked="0" layoutInCell="1" allowOverlap="1" wp14:anchorId="7B0F600C" wp14:editId="3D3C51A9">
             <wp:simplePos x="0" y="0"/>
             <wp:positionH relativeFrom="column">
-              <wp:posOffset>-842010</wp:posOffset>
+              <wp:posOffset>-756285</wp:posOffset>
             </wp:positionH>
             <wp:positionV relativeFrom="paragraph">
-              <wp:posOffset>1520825</wp:posOffset>
+              <wp:posOffset>329565</wp:posOffset>
+            </wp:positionV>
+            <wp:extent cx="6753225" cy="1125855"/>
+            <wp:effectExtent l="0" t="0" r="9525" b="0"/>
+            <wp:wrapTopAndBottom/>
+            <wp:docPr id="1343464140" name="Imagen 6"/>
+            <wp:cNvGraphicFramePr>
+              <a:graphicFrameLocks xmlns:a="http://schemas.openxmlformats.org/drawingml/2006/main" noChangeAspect="1"/>
+            </wp:cNvGraphicFramePr>
+            <a:graphic xmlns:a="http://schemas.openxmlformats.org/drawingml/2006/main">
+              <a:graphicData uri="http://schemas.openxmlformats.org/drawingml/2006/picture">
+                <pic:pic xmlns:pic="http://schemas.openxmlformats.org/drawingml/2006/picture">
+                  <pic:nvPicPr>
+                    <pic:cNvPr id="0" name="Picture 6"/>
+                    <pic:cNvPicPr>
+                      <a:picLocks noChangeAspect="1" noChangeArrowheads="1"/>
+                    </pic:cNvPicPr>
+                  </pic:nvPicPr>
+                  <pic:blipFill rotWithShape="1">
+                    <a:blip r:embed="rId14" cstate="print">
+                      <a:extLst>
+                        <a:ext uri="{28A0092B-C50C-407E-A947-70E740481C1C}">
+                          <a14:useLocalDpi xmlns:a14="http://schemas.microsoft.com/office/drawing/2010/main" val="0"/>
+                        </a:ext>
+                      </a:extLst>
+                    </a:blip>
+                    <a:srcRect r="41642"/>
+                    <a:stretch>
+                      <a:fillRect/>
+                    </a:stretch>
+                  </pic:blipFill>
+                  <pic:spPr bwMode="auto">
+                    <a:xfrm>
+                      <a:off x="0" y="0"/>
+                      <a:ext cx="6753225" cy="1125855"/>
+                    </a:xfrm>
+                    <a:prstGeom prst="rect">
+                      <a:avLst/>
+                    </a:prstGeom>
+                    <a:noFill/>
+                    <a:ln>
+                      <a:noFill/>
+                    </a:ln>
+                    <a:extLst>
+                      <a:ext uri="{53640926-AAD7-44D8-BBD7-CCE9431645EC}">
+                        <a14:shadowObscured xmlns:a14="http://schemas.microsoft.com/office/drawing/2010/main"/>
+                      </a:ext>
+                    </a:extLst>
+                  </pic:spPr>
+                </pic:pic>
+              </a:graphicData>
+            </a:graphic>
+            <wp14:sizeRelH relativeFrom="margin">
+              <wp14:pctWidth>0</wp14:pctWidth>
+            </wp14:sizeRelH>
+            <wp14:sizeRelV relativeFrom="margin">
+              <wp14:pctHeight>0</wp14:pctHeight>
+            </wp14:sizeRelV>
+          </wp:anchor>
+        </w:drawing>
+      </w:r>
+      <w:r>
+        <w:t>Figura 3.4. Dónde el ORM puede saltar al bucle y dónde no</w:t>
+      </w:r>
+    </w:p>
+    <w:p>
+      <w:pPr>
+        <w:pStyle w:val="Cuerpo"/>
+      </w:pPr>
+    </w:p>
+    <w:p>
+      <w:pPr>
+        <w:pStyle w:val="Cuerpo"/>
+      </w:pPr>
+    </w:p>
+    <w:p>
+      <w:pPr>
+        <w:pStyle w:val="Cuerpo"/>
+      </w:pPr>
+    </w:p>
+    <w:p>
+      <w:pPr>
+        <w:pStyle w:val="Epgrafedefigura"/>
+      </w:pPr>
+    </w:p>
+    <w:p>
+      <w:pPr>
+        <w:pStyle w:val="Epgrafedefigura"/>
+      </w:pPr>
+      <w:r>
+        <w:rPr>
+          <w:noProof/>
+        </w:rPr>
+        <w:lastRenderedPageBreak/>
+        <w:drawing>
+          <wp:anchor distT="0" distB="0" distL="114300" distR="114300" simplePos="0" relativeHeight="251663360" behindDoc="0" locked="0" layoutInCell="1" allowOverlap="1" wp14:anchorId="18CB57D4" wp14:editId="73BBC8B6">
+            <wp:simplePos x="0" y="0"/>
+            <wp:positionH relativeFrom="column">
+              <wp:posOffset>-752475</wp:posOffset>
+            </wp:positionH>
+            <wp:positionV relativeFrom="paragraph">
+              <wp:posOffset>-106332</wp:posOffset>
             </wp:positionV>
             <wp:extent cx="6631940" cy="1522095"/>
             <wp:effectExtent l="0" t="0" r="0" b="1905"/>
-            <wp:wrapTopAndBottom/>
+            <wp:wrapNone/>
             <wp:docPr id="304821258" name="Imagen 6"/>
             <wp:cNvGraphicFramePr>
               <a:graphicFrameLocks xmlns:a="http://schemas.openxmlformats.org/drawingml/2006/main" noChangeAspect="1"/>
@@ -5814,7 +7727,7 @@
                     </pic:cNvPicPr>
                   </pic:nvPicPr>
                   <pic:blipFill rotWithShape="1">
-                    <a:blip r:embed="rId14" cstate="print">
+                    <a:blip r:embed="rId15" cstate="print">
                       <a:extLst>
                         <a:ext uri="{28A0092B-C50C-407E-A947-70E740481C1C}">
                           <a14:useLocalDpi xmlns:a14="http://schemas.microsoft.com/office/drawing/2010/main" val="0"/>
@@ -5856,88 +7769,32 @@
           </wp:anchor>
         </w:drawing>
       </w:r>
-      <w:r>
-        <w:rPr>
-          <w:noProof/>
-        </w:rPr>
-        <w:drawing>
-          <wp:anchor distT="0" distB="0" distL="114300" distR="114300" simplePos="0" relativeHeight="251661312" behindDoc="0" locked="0" layoutInCell="1" allowOverlap="1" wp14:anchorId="7B0F600C" wp14:editId="60F29DE6">
-            <wp:simplePos x="0" y="0"/>
-            <wp:positionH relativeFrom="column">
-              <wp:posOffset>-756285</wp:posOffset>
-            </wp:positionH>
-            <wp:positionV relativeFrom="paragraph">
-              <wp:posOffset>329565</wp:posOffset>
-            </wp:positionV>
-            <wp:extent cx="6753225" cy="1125855"/>
-            <wp:effectExtent l="0" t="0" r="9525" b="0"/>
-            <wp:wrapTopAndBottom/>
-            <wp:docPr id="1343464140" name="Imagen 6"/>
-            <wp:cNvGraphicFramePr>
-              <a:graphicFrameLocks xmlns:a="http://schemas.openxmlformats.org/drawingml/2006/main" noChangeAspect="1"/>
-            </wp:cNvGraphicFramePr>
-            <a:graphic xmlns:a="http://schemas.openxmlformats.org/drawingml/2006/main">
-              <a:graphicData uri="http://schemas.openxmlformats.org/drawingml/2006/picture">
-                <pic:pic xmlns:pic="http://schemas.openxmlformats.org/drawingml/2006/picture">
-                  <pic:nvPicPr>
-                    <pic:cNvPr id="0" name="Picture 6"/>
-                    <pic:cNvPicPr>
-                      <a:picLocks noChangeAspect="1" noChangeArrowheads="1"/>
-                    </pic:cNvPicPr>
-                  </pic:nvPicPr>
-                  <pic:blipFill rotWithShape="1">
-                    <a:blip r:embed="rId15" cstate="print">
-                      <a:extLst>
-                        <a:ext uri="{28A0092B-C50C-407E-A947-70E740481C1C}">
-                          <a14:useLocalDpi xmlns:a14="http://schemas.microsoft.com/office/drawing/2010/main" val="0"/>
-                        </a:ext>
-                      </a:extLst>
-                    </a:blip>
-                    <a:srcRect r="41642"/>
-                    <a:stretch>
-                      <a:fillRect/>
-                    </a:stretch>
-                  </pic:blipFill>
-                  <pic:spPr bwMode="auto">
-                    <a:xfrm>
-                      <a:off x="0" y="0"/>
-                      <a:ext cx="6753225" cy="1125855"/>
-                    </a:xfrm>
-                    <a:prstGeom prst="rect">
-                      <a:avLst/>
-                    </a:prstGeom>
-                    <a:noFill/>
-                    <a:ln>
-                      <a:noFill/>
-                    </a:ln>
-                    <a:extLst>
-                      <a:ext uri="{53640926-AAD7-44D8-BBD7-CCE9431645EC}">
-                        <a14:shadowObscured xmlns:a14="http://schemas.microsoft.com/office/drawing/2010/main"/>
-                      </a:ext>
-                    </a:extLst>
-                  </pic:spPr>
-                </pic:pic>
-              </a:graphicData>
-            </a:graphic>
-            <wp14:sizeRelH relativeFrom="margin">
-              <wp14:pctWidth>0</wp14:pctWidth>
-            </wp14:sizeRelH>
-            <wp14:sizeRelV relativeFrom="margin">
-              <wp14:pctHeight>0</wp14:pctHeight>
-            </wp14:sizeRelV>
-          </wp:anchor>
-        </w:drawing>
-      </w:r>
-      <w:r>
-        <w:t>Figura 3.4. Dónde el ORM puede saltar al bucle y dónde no</w:t>
-      </w:r>
     </w:p>
     <w:p>
       <w:pPr>
         <w:pStyle w:val="Epgrafedefigura"/>
       </w:pPr>
-      <w:r>
-        <w:lastRenderedPageBreak/>
+    </w:p>
+    <w:p>
+      <w:pPr>
+        <w:pStyle w:val="Epgrafedefigura"/>
+      </w:pPr>
+    </w:p>
+    <w:p>
+      <w:pPr>
+        <w:pStyle w:val="Epgrafedefigura"/>
+      </w:pPr>
+    </w:p>
+    <w:p>
+      <w:pPr>
+        <w:pStyle w:val="Epgrafedefigura"/>
+      </w:pPr>
+    </w:p>
+    <w:p>
+      <w:pPr>
+        <w:pStyle w:val="Epgrafedefigura"/>
+      </w:pPr>
+      <w:r>
         <w:t>Figura 3.</w:t>
       </w:r>
       <w:r>
@@ -5947,8 +7804,13 @@
         <w:t>5</w:t>
       </w:r>
       <w:r>
-        <w:t>. Una traza de MissingGreenlet</w:t>
-      </w:r>
+        <w:t xml:space="preserve">. Una traza de </w:t>
+      </w:r>
+      <w:proofErr w:type="spellStart"/>
+      <w:r>
+        <w:t>MissingGreenlet</w:t>
+      </w:r>
+      <w:proofErr w:type="spellEnd"/>
     </w:p>
     <w:p>
       <w:pPr>
@@ -6004,7 +7866,21 @@
         <w:rPr>
           <w:b/>
         </w:rPr>
-        <w:t>una condición para que el endpoint funcione, no una recomendación.</w:t>
+        <w:t xml:space="preserve">una condición para que el </w:t>
+      </w:r>
+      <w:proofErr w:type="spellStart"/>
+      <w:r>
+        <w:rPr>
+          <w:b/>
+        </w:rPr>
+        <w:t>endpoint</w:t>
+      </w:r>
+      <w:proofErr w:type="spellEnd"/>
+      <w:r>
+        <w:rPr>
+          <w:b/>
+        </w:rPr>
+        <w:t xml:space="preserve"> funcione, no una recomendación.</w:t>
       </w:r>
       <w:r>
         <w:t xml:space="preserve"> El sistema </w:t>
@@ -6180,8 +8056,13 @@
               <w:spacing w:after="100"/>
               <w:jc w:val="left"/>
             </w:pPr>
+            <w:proofErr w:type="spellStart"/>
             <w:r>
-              <w:t xml:space="preserve">Fijate lo que eso significa: no es que el sistema sea más frágil. Es que </w:t>
+              <w:t>Fijate</w:t>
+            </w:r>
+            <w:proofErr w:type="spellEnd"/>
+            <w:r>
+              <w:t xml:space="preserve"> lo que eso significa: no es que el sistema sea más frágil. Es que </w:t>
             </w:r>
             <w:r>
               <w:rPr>
@@ -6200,7 +8081,23 @@
               <w:jc w:val="left"/>
             </w:pPr>
             <w:r>
-              <w:t xml:space="preserve">Es la misma idea que atraviesa todo el material, del backend y del frontend: </w:t>
+              <w:t xml:space="preserve">Es la misma idea que atraviesa todo el material, del </w:t>
+            </w:r>
+            <w:proofErr w:type="spellStart"/>
+            <w:r>
+              <w:t>backend</w:t>
+            </w:r>
+            <w:proofErr w:type="spellEnd"/>
+            <w:r>
+              <w:t xml:space="preserve"> y del </w:t>
+            </w:r>
+            <w:proofErr w:type="spellStart"/>
+            <w:r>
+              <w:t>frontend</w:t>
+            </w:r>
+            <w:proofErr w:type="spellEnd"/>
+            <w:r>
+              <w:t xml:space="preserve">: </w:t>
             </w:r>
             <w:r>
               <w:rPr>
@@ -6245,6 +8142,7 @@
         <w:rPr>
           <w:b w:val="0"/>
         </w:rPr>
+        <w:lastRenderedPageBreak/>
         <w:t>3.9. Tareas en segundo plano</w:t>
       </w:r>
       <w:bookmarkEnd w:id="13"/>
@@ -6274,15 +8172,65 @@
         </w:rPr>
         <w:t xml:space="preserve">no se lanzan con </w:t>
       </w:r>
+      <w:proofErr w:type="spellStart"/>
+      <w:proofErr w:type="gramStart"/>
       <w:r>
         <w:rPr>
           <w:rStyle w:val="Cdigoenlnea"/>
           <w:b/>
         </w:rPr>
-        <w:t>asyncio.create_task()</w:t>
-      </w:r>
-      <w:r>
-        <w:t xml:space="preserve">. Se encolan en taskiq o, si deben ocurrir sin falta, se escriben en el outbox. </w:t>
+        <w:t>asyncio.create</w:t>
+      </w:r>
+      <w:proofErr w:type="gramEnd"/>
+      <w:r>
+        <w:rPr>
+          <w:rStyle w:val="Cdigoenlnea"/>
+          <w:b/>
+        </w:rPr>
+        <w:t>_</w:t>
+      </w:r>
+      <w:proofErr w:type="gramStart"/>
+      <w:r>
+        <w:rPr>
+          <w:rStyle w:val="Cdigoenlnea"/>
+          <w:b/>
+        </w:rPr>
+        <w:t>task</w:t>
+      </w:r>
+      <w:proofErr w:type="spellEnd"/>
+      <w:r>
+        <w:rPr>
+          <w:rStyle w:val="Cdigoenlnea"/>
+          <w:b/>
+        </w:rPr>
+        <w:t>(</w:t>
+      </w:r>
+      <w:proofErr w:type="gramEnd"/>
+      <w:r>
+        <w:rPr>
+          <w:rStyle w:val="Cdigoenlnea"/>
+          <w:b/>
+        </w:rPr>
+        <w:t>)</w:t>
+      </w:r>
+      <w:r>
+        <w:t xml:space="preserve">. Se encolan en </w:t>
+      </w:r>
+      <w:proofErr w:type="spellStart"/>
+      <w:r>
+        <w:t>taskiq</w:t>
+      </w:r>
+      <w:proofErr w:type="spellEnd"/>
+      <w:r>
+        <w:t xml:space="preserve"> o, si deben ocurrir sin falta, se escriben en el </w:t>
+      </w:r>
+      <w:proofErr w:type="spellStart"/>
+      <w:r>
+        <w:t>outbox</w:t>
+      </w:r>
+      <w:proofErr w:type="spellEnd"/>
+      <w:r>
+        <w:t xml:space="preserve">. </w:t>
       </w:r>
       <w:r>
         <w:rPr>
@@ -6303,12 +8251,45 @@
       <w:pPr>
         <w:pStyle w:val="Bloquedecdigo"/>
       </w:pPr>
-      <w:r>
-        <w:t>asyncio.create_task(enviar_correo(pedido))   # prohibido por EA-07</w:t>
+      <w:proofErr w:type="spellStart"/>
+      <w:proofErr w:type="gramStart"/>
+      <w:r>
+        <w:t>asyncio.create</w:t>
+      </w:r>
+      <w:proofErr w:type="gramEnd"/>
+      <w:r>
+        <w:t>_task</w:t>
+      </w:r>
+      <w:proofErr w:type="spellEnd"/>
+      <w:r>
+        <w:t>(</w:t>
+      </w:r>
+      <w:proofErr w:type="spellStart"/>
+      <w:r>
+        <w:t>enviar_correo</w:t>
+      </w:r>
+      <w:proofErr w:type="spellEnd"/>
+      <w:r>
+        <w:t>(pedido</w:t>
+      </w:r>
+      <w:proofErr w:type="gramStart"/>
+      <w:r>
+        <w:t xml:space="preserve">))   </w:t>
+      </w:r>
+      <w:proofErr w:type="gramEnd"/>
+      <w:r>
+        <w:t># prohibido por EA-07</w:t>
       </w:r>
       <w:r>
         <w:br/>
-        <w:t>return respuesta</w:t>
+      </w:r>
+      <w:proofErr w:type="spellStart"/>
+      <w:r>
+        <w:t>return</w:t>
+      </w:r>
+      <w:proofErr w:type="spellEnd"/>
+      <w:r>
+        <w:t xml:space="preserve"> respuesta</w:t>
       </w:r>
     </w:p>
     <w:p>
@@ -6316,7 +8297,6 @@
         <w:pStyle w:val="Cuerpo"/>
       </w:pPr>
       <w:r>
-        <w:lastRenderedPageBreak/>
         <w:t>Eso responde rápido y tiene tres problemas, cada uno peor que el anterior.</w:t>
       </w:r>
     </w:p>
@@ -6367,7 +8347,15 @@
         <w:pStyle w:val="Cuerpo"/>
       </w:pPr>
       <w:r>
-        <w:t xml:space="preserve">La alternativa que el TPI declara —encolar en la cola de tareas, o escribir en el outbox si el hecho no se puede perder— resuelve las tres: </w:t>
+        <w:t xml:space="preserve">La alternativa que el TPI declara —encolar en la cola de tareas, o escribir en el </w:t>
+      </w:r>
+      <w:proofErr w:type="spellStart"/>
+      <w:r>
+        <w:t>outbox</w:t>
+      </w:r>
+      <w:proofErr w:type="spellEnd"/>
+      <w:r>
+        <w:t xml:space="preserve"> si el hecho no se puede perder— resuelve las tres: </w:t>
       </w:r>
       <w:r>
         <w:rPr>
@@ -6480,7 +8468,15 @@
               <w:jc w:val="left"/>
             </w:pPr>
             <w:r>
-              <w:t xml:space="preserve">No dice "cuidado con reintentar". Dice que </w:t>
+              <w:t xml:space="preserve">No dice "cuidado con reintentar". Dice </w:t>
+            </w:r>
+            <w:proofErr w:type="gramStart"/>
+            <w:r>
+              <w:t>que</w:t>
+            </w:r>
+            <w:proofErr w:type="gramEnd"/>
+            <w:r>
+              <w:t xml:space="preserve"> </w:t>
             </w:r>
             <w:r>
               <w:rPr>
@@ -6518,7 +8514,15 @@
               <w:jc w:val="left"/>
             </w:pPr>
             <w:r>
-              <w:t xml:space="preserve">Entonces el reintento no es una decisión que podés evitar: </w:t>
+              <w:t xml:space="preserve">Entonces el reintento no es una decisión que </w:t>
+            </w:r>
+            <w:proofErr w:type="spellStart"/>
+            <w:r>
+              <w:t>podés</w:t>
+            </w:r>
+            <w:proofErr w:type="spellEnd"/>
+            <w:r>
+              <w:t xml:space="preserve"> evitar: </w:t>
             </w:r>
             <w:r>
               <w:rPr>
@@ -6527,7 +8531,23 @@
               <w:t>va a pasar</w:t>
             </w:r>
             <w:r>
-              <w:t>, porque un worker puede morir después de hacer el trabajo y antes de confirmar el mensaje. Lo único que podés decidir es si tu tarea lo tolera.</w:t>
+              <w:t xml:space="preserve">, porque un </w:t>
+            </w:r>
+            <w:proofErr w:type="spellStart"/>
+            <w:r>
+              <w:t>worker</w:t>
+            </w:r>
+            <w:proofErr w:type="spellEnd"/>
+            <w:r>
+              <w:t xml:space="preserve"> puede morir después de hacer el trabajo y antes de confirmar el mensaje. Lo único que </w:t>
+            </w:r>
+            <w:proofErr w:type="spellStart"/>
+            <w:r>
+              <w:t>podés</w:t>
+            </w:r>
+            <w:proofErr w:type="spellEnd"/>
+            <w:r>
+              <w:t xml:space="preserve"> decidir es si tu tarea lo tolera.</w:t>
             </w:r>
           </w:p>
           <w:p>
@@ -6537,7 +8557,15 @@
               <w:jc w:val="left"/>
             </w:pPr>
             <w:r>
-              <w:t xml:space="preserve">Del otro lado del cable pasa exactamente lo mismo y tus compañeros lo van a ver: el checkout genera una clave de idempotencia justamente porque </w:t>
+              <w:t xml:space="preserve">Del otro lado del cable pasa exactamente lo mismo y tus compañeros lo van a ver: el </w:t>
+            </w:r>
+            <w:proofErr w:type="spellStart"/>
+            <w:r>
+              <w:t>checkout</w:t>
+            </w:r>
+            <w:proofErr w:type="spellEnd"/>
+            <w:r>
+              <w:t xml:space="preserve"> genera una clave de idempotencia justamente porque </w:t>
             </w:r>
             <w:r>
               <w:rPr>
@@ -6741,13 +8769,23 @@
         <w:sz w:val="15"/>
       </w:rPr>
     </w:pPr>
+    <w:proofErr w:type="spellStart"/>
     <w:r>
       <w:rPr>
         <w:rFonts w:ascii="Calibri" w:hAnsi="Calibri" w:cs="Calibri"/>
         <w:color w:val="595959"/>
         <w:sz w:val="15"/>
       </w:rPr>
-      <w:t>Backend desde POO · Unidad 3 — El bucle de eventos del servidor</w:t>
+      <w:t>Backend</w:t>
+    </w:r>
+    <w:proofErr w:type="spellEnd"/>
+    <w:r>
+      <w:rPr>
+        <w:rFonts w:ascii="Calibri" w:hAnsi="Calibri" w:cs="Calibri"/>
+        <w:color w:val="595959"/>
+        <w:sz w:val="15"/>
+      </w:rPr>
+      <w:t xml:space="preserve"> desde POO · Unidad 3 — El bucle de eventos del servidor</w:t>
     </w:r>
   </w:p>
 </w:hdr>

</xml_diff>